<commit_message>
updated with comments and docstrings
</commit_message>
<xml_diff>
--- a/test_letter.docx
+++ b/test_letter.docx
@@ -89,7 +89,11 @@
     </w:p>
     <w:p>
       <w:r>
-        <w:t>Den nuværende kørsel ophører pr. 01-01-2028.</w:t>
+        <w:t>Kørslen bevilges i følgende form:</w:t>
+        <w:br/>
+        <w:t>• rutekoersel [Morgen] fra 01-01-2026 til 01-01-2027.</w:t>
+        <w:br/>
+        <w:t>• skolerejsekort [Eftermiddag] fra 01-01-2026 til 01-01-2027.</w:t>
       </w:r>
     </w:p>
     <w:p>
@@ -174,6 +178,23 @@
     <w:p>
       <w:r>
         <w:t>Du får nærmere information fra Kørselskontoret angående den konkrete planlægning af dit barns kørsel. Har du spørgsmål til planlægning af kørslen, kan du kontakte Kørselskontoret på tlf. 89 40 60 10.</w:t>
+      </w:r>
+    </w:p>
+    <w:p>
+      <w:r>
+        <w:rPr>
+          <w:b/>
+        </w:rPr>
+        <w:t>Information om skolerejsekort</w:t>
+        <w:br/>
+      </w:r>
+      <w:r>
+        <w:t xml:space="preserve">Rejsekortet bestilles af skolen. Vi sørger for at give besked til skolen om at bestille skolerejsekortet. Leveringstiden på skolerejsekortet er ca. 10 dage. </w:t>
+      </w:r>
+    </w:p>
+    <w:p>
+      <w:r>
+        <w:t>Du skal selv hjælpe dit barn med at lære at tage bussen til og fra skole. Rejsekortet er aktivt i skoleåret fra august til juni. Når dit barn har fået et skolerejsekort, kan barnet frit køre alle ugens 7 dage (dog ikke i natbus) indenfor de tildelte zoner mellem folkeregisteradressen og skolen.</w:t>
       </w:r>
     </w:p>
     <w:p>
@@ -341,7 +362,70 @@
     </w:p>
     <w:p>
       <w:r>
-        <w:t>Den nuværende kørsel ophører pr. 01-01-2028.</w:t>
+        <w:t xml:space="preserve">Ved transport med offentlig transport vil </w:t>
+      </w:r>
+      <w:r>
+        <w:rPr>
+          <w:color w:val="0F9ED5"/>
+        </w:rPr>
+        <w:t>Kasper</w:t>
+      </w:r>
+      <w:r>
+        <w:t xml:space="preserve"> fra </w:t>
+      </w:r>
+      <w:r>
+        <w:rPr>
+          <w:color w:val="0F9ED5"/>
+        </w:rPr>
+        <w:t>Gade 1, 8000 Aarhus C</w:t>
+      </w:r>
+      <w:r>
+        <w:t xml:space="preserve"> til </w:t>
+      </w:r>
+      <w:r>
+        <w:rPr>
+          <w:color w:val="0F9ED5"/>
+        </w:rPr>
+        <w:t>Langagerskolen</w:t>
+      </w:r>
+      <w:r>
+        <w:t xml:space="preserve"> have en samlet rejsetid på ca. </w:t>
+      </w:r>
+      <w:r>
+        <w:rPr>
+          <w:color w:val="E87331"/>
+        </w:rPr>
+        <w:t>Transporttid i bus</w:t>
+      </w:r>
+      <w:r>
+        <w:t xml:space="preserve"> min. </w:t>
+      </w:r>
+      <w:r>
+        <w:rPr>
+          <w:color w:val="E87331"/>
+        </w:rPr>
+        <w:t>Skift med bus?</w:t>
+      </w:r>
+      <w:r>
+        <w:t xml:space="preserve"> skift. Vi vurderer at rejsetiden for en elev på </w:t>
+      </w:r>
+      <w:r>
+        <w:rPr>
+          <w:color w:val="0F9ED5"/>
+        </w:rPr>
+        <w:t>2</w:t>
+      </w:r>
+      <w:r>
+        <w:t>. klassetrin er indenfor rammerne af Aarhus Kommunes serviceniveau for kørsel.</w:t>
+      </w:r>
+    </w:p>
+    <w:p>
+      <w:r>
+        <w:t>Kørslen bevilges i følgende form:</w:t>
+        <w:br/>
+        <w:t>• rutekoersel [Morgen] fra 01-01-2026 til 01-01-2027.</w:t>
+        <w:br/>
+        <w:t>• skolerejsekort [Eftermiddag] fra 01-01-2026 til 01-01-2027.</w:t>
       </w:r>
     </w:p>
     <w:p>

</xml_diff>

<commit_message>
updated to handle embedded links
</commit_message>
<xml_diff>
--- a/test_letter.docx
+++ b/test_letter.docx
@@ -5,14 +5,322 @@
     <w:tbl>
       <w:tblPr>
         <w:tblStyle w:val="Tabel-Gitter"/>
+        <w:tblpPr w:vertAnchor="page" w:horzAnchor="page" w:tblpX="8619" w:tblpY="5302"/>
+        <w:tblOverlap w:val="never"/>
         <w:tblW w:w="0" w:type="auto"/>
         <w:tblBorders>
-          <w:top w:val="none" w:color="auto" w:sz="0" w:space="0"/>
-          <w:left w:val="none" w:color="auto" w:sz="0" w:space="0"/>
-          <w:bottom w:val="none" w:color="auto" w:sz="0" w:space="0"/>
-          <w:right w:val="none" w:color="auto" w:sz="0" w:space="0"/>
-          <w:insideH w:val="none" w:color="auto" w:sz="0" w:space="0"/>
-          <w:insideV w:val="none" w:color="auto" w:sz="0" w:space="0"/>
+          <w:top w:val="none" w:sz="0" w:space="0" w:color="auto"/>
+          <w:left w:val="none" w:sz="0" w:space="0" w:color="auto"/>
+          <w:bottom w:val="none" w:sz="0" w:space="0" w:color="auto"/>
+          <w:right w:val="none" w:sz="0" w:space="0" w:color="auto"/>
+          <w:insideH w:val="none" w:sz="0" w:space="0" w:color="auto"/>
+          <w:insideV w:val="none" w:sz="0" w:space="0" w:color="auto"/>
+        </w:tblBorders>
+        <w:tblCellMar>
+          <w:left w:w="0" w:type="dxa"/>
+          <w:right w:w="0" w:type="dxa"/>
+        </w:tblCellMar>
+        <w:tblLook w:val="0400" w:firstRow="0" w:lastRow="0" w:firstColumn="0" w:lastColumn="0" w:noHBand="0" w:noVBand="1"/>
+        <w:tblCaption w:val="Returadresse og modtagerinformation"/>
+        <w:tblDescription w:val="Returadresse og modtagerinformation"/>
+      </w:tblPr>
+      <w:tblGrid>
+        <w:gridCol w:w="2948"/>
+      </w:tblGrid>
+      <w:tr>
+        <w:trPr>
+          <w:trHeight w:hRule="exact" w:val="1503"/>
+        </w:trPr>
+        <w:tc>
+          <w:tcPr>
+            <w:tcW w:w="2948" w:type="dxa"/>
+          </w:tcPr>
+          <w:p>
+            <w:pPr>
+              <w:pStyle w:val="Afsender"/>
+              <w:framePr w:wrap="auto" w:vAnchor="margin" w:hAnchor="text" w:xAlign="left" w:yAlign="inline"/>
+              <w:suppressOverlap w:val="0"/>
+              <w:rPr>
+                <w:rFonts w:cs="Arial"/>
+              </w:rPr>
+            </w:pPr>
+            <w:r>
+              <w:rPr>
+                <w:rFonts w:cs="Arial"/>
+                <w:b/>
+                <w:caps/>
+                <w:sz w:val="22"/>
+              </w:rPr>
+              <w:t>Børn og Unge</w:t>
+            </w:r>
+          </w:p>
+          <w:p>
+            <w:pPr>
+              <w:pStyle w:val="Afsender"/>
+              <w:framePr w:wrap="auto" w:vAnchor="margin" w:hAnchor="text" w:xAlign="left" w:yAlign="inline"/>
+              <w:suppressOverlap w:val="0"/>
+              <w:rPr>
+                <w:rFonts w:cs="Arial"/>
+              </w:rPr>
+            </w:pPr>
+            <w:r>
+              <w:rPr>
+                <w:rFonts w:cs="Arial"/>
+              </w:rPr>
+              <w:t>Administration og Rådgivning</w:t>
+            </w:r>
+          </w:p>
+          <w:p>
+            <w:pPr>
+              <w:pStyle w:val="Afsender"/>
+              <w:framePr w:wrap="auto" w:vAnchor="margin" w:hAnchor="text" w:xAlign="left" w:yAlign="inline"/>
+              <w:suppressOverlap w:val="0"/>
+            </w:pPr>
+            <w:r>
+              <w:rPr>
+                <w:rFonts w:cs="Arial"/>
+              </w:rPr>
+              <w:t>Aarhus Kommune</w:t>
+            </w:r>
+          </w:p>
+        </w:tc>
+      </w:tr>
+      <w:tr>
+        <w:trPr>
+          <w:trHeight w:val="3885"/>
+        </w:trPr>
+        <w:tc>
+          <w:tcPr>
+            <w:tcW w:w="2948" w:type="dxa"/>
+          </w:tcPr>
+          <w:p>
+            <w:pPr>
+              <w:pStyle w:val="Afsender"/>
+              <w:framePr w:wrap="auto" w:vAnchor="margin" w:hAnchor="text" w:xAlign="left" w:yAlign="inline"/>
+              <w:suppressOverlap w:val="0"/>
+              <w:rPr>
+                <w:rFonts w:cs="Arial"/>
+              </w:rPr>
+            </w:pPr>
+            <w:r>
+              <w:rPr>
+                <w:rFonts w:cs="Arial"/>
+                <w:b/>
+              </w:rPr>
+              <w:t>Budget &amp; Regnskab - Analyse og System</w:t>
+            </w:r>
+          </w:p>
+          <w:p>
+            <w:pPr>
+              <w:pStyle w:val="Afsender"/>
+              <w:framePr w:wrap="auto" w:vAnchor="margin" w:hAnchor="text" w:xAlign="left" w:yAlign="inline"/>
+              <w:suppressOverlap w:val="0"/>
+              <w:rPr>
+                <w:rFonts w:cs="Arial"/>
+              </w:rPr>
+            </w:pPr>
+            <w:r>
+              <w:rPr>
+                <w:rFonts w:cs="Arial"/>
+              </w:rPr>
+              <w:t>Grøndalsvej 2</w:t>
+            </w:r>
+          </w:p>
+          <w:p>
+            <w:pPr>
+              <w:pStyle w:val="Afsender"/>
+              <w:framePr w:wrap="auto" w:vAnchor="margin" w:hAnchor="text" w:xAlign="left" w:yAlign="inline"/>
+              <w:suppressOverlap w:val="0"/>
+              <w:rPr>
+                <w:rFonts w:cs="Arial"/>
+              </w:rPr>
+            </w:pPr>
+            <w:r>
+              <w:rPr>
+                <w:rFonts w:cs="Arial"/>
+              </w:rPr>
+              <w:t>8260 Viby J</w:t>
+            </w:r>
+          </w:p>
+          <w:p>
+            <w:pPr>
+              <w:pStyle w:val="Afsender"/>
+              <w:framePr w:wrap="auto" w:vAnchor="margin" w:hAnchor="text" w:xAlign="left" w:yAlign="inline"/>
+              <w:suppressOverlap w:val="0"/>
+              <w:rPr>
+                <w:rFonts w:cs="Arial"/>
+              </w:rPr>
+            </w:pPr>
+          </w:p>
+          <w:p>
+            <w:pPr>
+              <w:pStyle w:val="Afsender"/>
+              <w:framePr w:wrap="auto" w:vAnchor="margin" w:hAnchor="text" w:xAlign="left" w:yAlign="inline"/>
+              <w:suppressOverlap w:val="0"/>
+              <w:rPr>
+                <w:rFonts w:cs="Arial"/>
+              </w:rPr>
+            </w:pPr>
+            <w:r>
+              <w:rPr>
+                <w:rFonts w:cs="Arial"/>
+              </w:rPr>
+              <w:t>Telefon: 89 40 40 04</w:t>
+            </w:r>
+          </w:p>
+          <w:p>
+            <w:pPr>
+              <w:pStyle w:val="Afsender"/>
+              <w:framePr w:wrap="auto" w:vAnchor="margin" w:hAnchor="text" w:xAlign="left" w:yAlign="inline"/>
+              <w:suppressOverlap w:val="0"/>
+              <w:rPr>
+                <w:rFonts w:cs="Arial"/>
+              </w:rPr>
+            </w:pPr>
+          </w:p>
+          <w:p>
+            <w:pPr>
+              <w:pStyle w:val="Afsender"/>
+              <w:framePr w:wrap="auto" w:vAnchor="margin" w:hAnchor="text" w:xAlign="left" w:yAlign="inline"/>
+              <w:suppressOverlap w:val="0"/>
+              <w:rPr>
+                <w:rFonts w:cs="Arial"/>
+              </w:rPr>
+            </w:pPr>
+            <w:r>
+              <w:rPr>
+                <w:rFonts w:cs="Arial"/>
+              </w:rPr>
+              <w:t>E-mail:</w:t>
+            </w:r>
+          </w:p>
+          <w:p>
+            <w:r>
+              <w:rPr>
+                <w:rFonts w:cs="Arial"/>
+              </w:rPr>
+              <w:t>befordring@mbu.aarhus.dk</w:t>
+            </w:r>
+          </w:p>
+          <w:p>
+            <w:pPr>
+              <w:pStyle w:val="Afsender"/>
+              <w:framePr w:wrap="auto" w:vAnchor="margin" w:hAnchor="text" w:xAlign="left" w:yAlign="inline"/>
+              <w:suppressOverlap w:val="0"/>
+              <w:rPr>
+                <w:rFonts w:cs="Arial"/>
+              </w:rPr>
+            </w:pPr>
+          </w:p>
+          <w:p>
+            <w:pPr>
+              <w:rPr>
+                <w:rFonts w:cs="Arial"/>
+              </w:rPr>
+            </w:pPr>
+            <w:r>
+              <w:rPr>
+                <w:rFonts w:cs="Arial"/>
+              </w:rPr>
+              <w:t>Sag:</w:t>
+            </w:r>
+            <w:r>
+              <w:rPr>
+                <w:rFonts w:cs="Arial"/>
+              </w:rPr>
+              <w:t xml:space="preserve"> 12345</w:t>
+            </w:r>
+          </w:p>
+          <w:p>
+            <w:pPr>
+              <w:pStyle w:val="Afsender"/>
+              <w:framePr w:wrap="auto" w:vAnchor="margin" w:hAnchor="text" w:xAlign="left" w:yAlign="inline"/>
+              <w:suppressOverlap w:val="0"/>
+              <w:rPr>
+                <w:rFonts w:cs="Arial"/>
+              </w:rPr>
+            </w:pPr>
+            <w:r>
+              <w:rPr>
+                <w:rFonts w:cs="Arial"/>
+              </w:rPr>
+              <w:t xml:space="preserve">Dokumentnummer: </w:t>
+            </w:r>
+          </w:p>
+          <w:p>
+            <w:pPr>
+              <w:rPr>
+                <w:rFonts w:cs="Arial"/>
+              </w:rPr>
+            </w:pPr>
+            <w:r>
+              <w:rPr>
+                <w:rFonts w:cs="Arial"/>
+              </w:rPr>
+              <w:t>1232543åperotdlfm</w:t>
+            </w:r>
+          </w:p>
+          <w:p>
+            <w:pPr>
+              <w:pStyle w:val="Afsender"/>
+              <w:framePr w:wrap="auto" w:vAnchor="margin" w:hAnchor="text" w:xAlign="left" w:yAlign="inline"/>
+              <w:suppressOverlap w:val="0"/>
+              <w:rPr>
+                <w:rFonts w:cs="Arial"/>
+              </w:rPr>
+            </w:pPr>
+          </w:p>
+          <w:p>
+            <w:pPr>
+              <w:pStyle w:val="Afsender"/>
+              <w:framePr w:wrap="auto" w:vAnchor="margin" w:hAnchor="text" w:xAlign="left" w:yAlign="inline"/>
+              <w:suppressOverlap w:val="0"/>
+              <w:rPr>
+                <w:rFonts w:cs="Arial"/>
+              </w:rPr>
+            </w:pPr>
+            <w:r>
+              <w:rPr>
+                <w:rFonts w:cs="Arial"/>
+              </w:rPr>
+              <w:t>Sagsbehandler:</w:t>
+            </w:r>
+          </w:p>
+          <w:p>
+            <w:pPr>
+              <w:rPr>
+                <w:rFonts w:cs="Arial"/>
+              </w:rPr>
+            </w:pPr>
+            <w:r>
+              <w:rPr>
+                <w:rFonts w:cs="Arial"/>
+              </w:rPr>
+              <w:t>Sofie Elrum</w:t>
+            </w:r>
+          </w:p>
+          <w:p>
+            <w:pPr>
+              <w:rPr>
+                <w:rFonts w:cs="Arial"/>
+              </w:rPr>
+            </w:pPr>
+          </w:p>
+        </w:tc>
+      </w:tr>
+    </w:tbl>
+    <w:tbl>
+      <w:tblPr>
+        <w:tblStyle w:val="Tabel-Gitter"/>
+        <w:tblpPr w:leftFromText="180" w:rightFromText="180" w:vertAnchor="page" w:horzAnchor="margin" w:tblpY="1621"/>
+        <w:tblW w:w="0" w:type="auto"/>
+        <w:tblBorders>
+          <w:top w:val="none" w:sz="0" w:space="0" w:color="auto"/>
+          <w:left w:val="none" w:sz="0" w:space="0" w:color="auto"/>
+          <w:bottom w:val="none" w:sz="0" w:space="0" w:color="auto"/>
+          <w:right w:val="none" w:sz="0" w:space="0" w:color="auto"/>
+          <w:insideH w:val="none" w:sz="0" w:space="0" w:color="auto"/>
+          <w:insideV w:val="none" w:sz="0" w:space="0" w:color="auto"/>
         </w:tblBorders>
         <w:tblCellMar>
           <w:top w:w="113" w:type="dxa"/>
@@ -29,342 +337,120 @@
       </w:tblGrid>
       <w:tr>
         <w:trPr>
-          <w:trHeight w:val="567" w:hRule="exact"/>
+          <w:trHeight w:hRule="exact" w:val="567"/>
         </w:trPr>
         <w:tc>
           <w:tcPr>
             <w:tcW w:w="4820" w:type="dxa"/>
             <w:tcBorders>
-              <w:bottom w:val="single" w:color="auto" w:sz="4" w:space="0"/>
+              <w:bottom w:val="single" w:sz="4" w:space="0" w:color="auto"/>
             </w:tcBorders>
             <w:vAlign w:val="bottom"/>
           </w:tcPr>
           <w:p>
             <w:pPr>
               <w:pStyle w:val="Returadresse"/>
-              <w:framePr w:wrap="auto" w:hAnchor="text" w:vAnchor="margin" w:xAlign="left" w:yAlign="inline"/>
+              <w:framePr w:wrap="auto" w:vAnchor="margin" w:hAnchor="text" w:xAlign="left" w:yAlign="inline"/>
               <w:suppressOverlap w:val="0"/>
               <w:rPr>
                 <w:rFonts w:cs="Arial"/>
               </w:rPr>
             </w:pPr>
             <w:r>
+              <w:rPr>
+                <w:rFonts w:cs="Arial"/>
+              </w:rPr>
               <w:t>Budget &amp; Regnskab - Analyse og System</w:t>
             </w:r>
           </w:p>
           <w:p>
             <w:pPr>
               <w:pStyle w:val="Returadresse"/>
-              <w:framePr w:wrap="auto" w:hAnchor="text" w:vAnchor="margin" w:xAlign="left" w:yAlign="inline"/>
+              <w:framePr w:wrap="auto" w:vAnchor="margin" w:hAnchor="text" w:xAlign="left" w:yAlign="inline"/>
               <w:suppressOverlap w:val="0"/>
             </w:pPr>
             <w:r>
+              <w:rPr>
+                <w:rFonts w:cs="Arial"/>
+              </w:rPr>
               <w:t>Grøndalsvej 2, 8260 Viby J</w:t>
             </w:r>
           </w:p>
         </w:tc>
       </w:tr>
-      <w:tr>
-        <w:trPr>
-          <w:trHeight w:val="1701" w:hRule="exact"/>
-        </w:trPr>
-        <w:tc>
-          <w:tcPr>
-            <w:tcW w:w="4820" w:type="dxa"/>
-            <w:tcBorders>
-              <w:top w:val="single" w:color="auto" w:sz="4" w:space="0"/>
-            </w:tcBorders>
-          </w:tcPr>
-          <w:p>
-            <w:pPr>
-              <w:pStyle w:val="Modtager"/>
-              <w:framePr w:wrap="auto" w:hAnchor="text" w:vAnchor="margin" w:xAlign="left" w:yAlign="inline"/>
-              <w:suppressOverlap w:val="0"/>
-            </w:pPr>
-            <w:r/>
-          </w:p>
-        </w:tc>
-      </w:tr>
-    </w:tbl>
-    <w:tbl>
-      <w:tblPr>
-        <w:tblStyle w:val="Tabel-Gitter"/>
-        <w:tblpPr w:vertAnchor="page" w:horzAnchor="page" w:tblpX="8619" w:tblpY="5302"/>
-        <w:tblOverlap w:val="never"/>
-        <w:tblW w:w="0" w:type="auto"/>
-        <w:tblBorders>
-          <w:top w:val="none" w:color="auto" w:sz="0" w:space="0"/>
-          <w:left w:val="none" w:color="auto" w:sz="0" w:space="0"/>
-          <w:bottom w:val="none" w:color="auto" w:sz="0" w:space="0"/>
-          <w:right w:val="none" w:color="auto" w:sz="0" w:space="0"/>
-          <w:insideH w:val="none" w:color="auto" w:sz="0" w:space="0"/>
-          <w:insideV w:val="none" w:color="auto" w:sz="0" w:space="0"/>
-        </w:tblBorders>
-        <w:tblCellMar>
-          <w:left w:w="0" w:type="dxa"/>
-          <w:right w:w="0" w:type="dxa"/>
-        </w:tblCellMar>
-        <w:tblLook w:val="0400" w:firstRow="0" w:lastRow="0" w:firstColumn="0" w:lastColumn="0" w:noHBand="0" w:noVBand="1"/>
-        <w:tblCaption w:val="Returadresse og modtagerinformation"/>
-        <w:tblDescription w:val="Returadresse og modtagerinformation"/>
-      </w:tblPr>
-      <w:tblGrid>
-        <w:gridCol w:w="2948"/>
-      </w:tblGrid>
-      <w:tr>
-        <w:trPr>
-          <w:trHeight w:val="1503" w:hRule="exact"/>
-        </w:trPr>
-        <w:tc>
-          <w:tcPr>
-            <w:tcW w:w="2948" w:type="dxa"/>
-            <w:tcMar/>
-          </w:tcPr>
-          <w:p>
-            <w:pPr>
-              <w:pStyle w:val="Afsender"/>
-              <w:framePr w:wrap="auto" w:hAnchor="text" w:vAnchor="margin" w:xAlign="left" w:yAlign="inline"/>
-              <w:suppressOverlap w:val="0"/>
-              <w:rPr>
-                <w:rFonts w:cs="Arial"/>
-              </w:rPr>
-            </w:pPr>
-            <w:r>
-              <w:t>Børn og Unge</w:t>
-            </w:r>
-          </w:p>
-          <w:p>
-            <w:pPr>
-              <w:pStyle w:val="Afsender"/>
-              <w:framePr w:wrap="auto" w:hAnchor="text" w:vAnchor="margin" w:xAlign="left" w:yAlign="inline"/>
-              <w:suppressOverlap w:val="0"/>
-              <w:rPr>
-                <w:rFonts w:cs="Arial"/>
-              </w:rPr>
-            </w:pPr>
-            <w:r>
-              <w:t>Administration og Rådgivning</w:t>
-            </w:r>
-          </w:p>
-          <w:p>
-            <w:pPr>
-              <w:pStyle w:val="Afsender"/>
-              <w:framePr w:wrap="auto" w:hAnchor="text" w:vAnchor="margin" w:xAlign="left" w:yAlign="inline"/>
-              <w:suppressOverlap w:val="0"/>
-            </w:pPr>
-            <w:r>
-              <w:t>Aarhus Kommune</w:t>
-            </w:r>
-          </w:p>
-        </w:tc>
-      </w:tr>
-      <w:tr>
-        <w:trPr>
-          <w:trHeight w:val="6917" w:hRule="exact"/>
-        </w:trPr>
-        <w:tc>
-          <w:tcPr>
-            <w:tcW w:w="2948" w:type="dxa"/>
-            <w:tcMar/>
-          </w:tcPr>
-          <w:p>
-            <w:pPr>
-              <w:pStyle w:val="Afsender"/>
-              <w:framePr w:wrap="auto" w:hAnchor="text" w:vAnchor="margin" w:xAlign="left" w:yAlign="inline"/>
-              <w:suppressOverlap w:val="0"/>
-              <w:rPr>
-                <w:rFonts w:cs="Arial"/>
-              </w:rPr>
-            </w:pPr>
-            <w:r>
-              <w:t>Budget &amp; Regnskab - Analyse og System</w:t>
-            </w:r>
-          </w:p>
-          <w:p>
-            <w:pPr>
-              <w:pStyle w:val="Afsender"/>
-              <w:framePr w:wrap="auto" w:hAnchor="text" w:vAnchor="margin" w:xAlign="left" w:yAlign="inline"/>
-              <w:suppressOverlap w:val="0"/>
-              <w:rPr>
-                <w:rFonts w:cs="Arial"/>
-              </w:rPr>
-            </w:pPr>
-            <w:r>
-              <w:t>Grøndalsvej 2</w:t>
-            </w:r>
-          </w:p>
-          <w:p>
-            <w:pPr>
-              <w:pStyle w:val="Afsender"/>
-              <w:framePr w:wrap="auto" w:hAnchor="text" w:vAnchor="margin" w:xAlign="left" w:yAlign="inline"/>
-              <w:suppressOverlap w:val="0"/>
-              <w:rPr>
-                <w:rFonts w:cs="Arial"/>
-              </w:rPr>
-            </w:pPr>
-            <w:r>
-              <w:t>8260 Viby J</w:t>
-            </w:r>
-          </w:p>
-          <w:p>
-            <w:pPr>
-              <w:pStyle w:val="Afsender"/>
-              <w:framePr w:wrap="auto" w:hAnchor="text" w:vAnchor="margin" w:xAlign="left" w:yAlign="inline"/>
-              <w:suppressOverlap w:val="0"/>
-              <w:rPr>
-                <w:rFonts w:cs="Arial"/>
-              </w:rPr>
-            </w:pPr>
-            <w:r/>
-          </w:p>
-          <w:p>
-            <w:pPr>
-              <w:pStyle w:val="Afsender"/>
-              <w:framePr w:wrap="auto" w:hAnchor="text" w:vAnchor="margin" w:xAlign="left" w:yAlign="inline"/>
-              <w:suppressOverlap w:val="0"/>
-              <w:rPr>
-                <w:rFonts w:cs="Arial"/>
-              </w:rPr>
-            </w:pPr>
-            <w:r>
-              <w:t>Telefon: 89 40 40 04</w:t>
-            </w:r>
-          </w:p>
-          <w:p>
-            <w:pPr>
-              <w:pStyle w:val="Afsender"/>
-              <w:framePr w:wrap="auto" w:hAnchor="text" w:vAnchor="margin" w:xAlign="left" w:yAlign="inline"/>
-              <w:suppressOverlap w:val="0"/>
-              <w:rPr>
-                <w:rFonts w:cs="Arial"/>
-              </w:rPr>
-            </w:pPr>
-            <w:r/>
-          </w:p>
-          <w:p>
-            <w:pPr>
-              <w:pStyle w:val="Afsender"/>
-              <w:framePr w:wrap="auto" w:hAnchor="text" w:vAnchor="margin" w:xAlign="left" w:yAlign="inline"/>
-              <w:suppressOverlap w:val="0"/>
-              <w:rPr>
-                <w:rFonts w:cs="Arial"/>
-              </w:rPr>
-            </w:pPr>
-            <w:r>
-              <w:t>E-mail:</w:t>
-            </w:r>
-          </w:p>
-          <w:p>
-            <w:pPr>
-              <w:pStyle w:val="Normal"/>
-              <w:suppressLineNumbers w:val="0"/>
-              <w:bidi w:val="0"/>
-              <w:spacing w:before="0" w:beforeAutospacing="off" w:after="0" w:afterAutospacing="off" w:line="260" w:lineRule="atLeast"/>
-              <w:ind w:left="0" w:right="0"/>
-              <w:jc w:val="left"/>
-            </w:pPr>
-            <w:r>
-              <w:t>befordring@mbu.aarhus.dk</w:t>
-            </w:r>
-          </w:p>
-          <w:p>
-            <w:pPr>
-              <w:pStyle w:val="Afsender"/>
-              <w:framePr w:wrap="auto" w:hAnchor="text" w:vAnchor="margin" w:xAlign="left" w:yAlign="inline"/>
-              <w:suppressOverlap w:val="0"/>
-              <w:rPr>
-                <w:rFonts w:cs="Arial"/>
-              </w:rPr>
-            </w:pPr>
-            <w:r/>
-          </w:p>
-          <w:p>
-            <w:pPr>
-              <w:pStyle w:val="Normal"/>
-              <w:framePr w:wrap="auto" w:hAnchor="text" w:vAnchor="margin" w:xAlign="left" w:yAlign="inline"/>
-              <w:suppressOverlap w:val="0"/>
-              <w:rPr>
-                <w:rFonts w:cs="Arial"/>
-              </w:rPr>
-            </w:pPr>
-            <w:r>
-              <w:t>Sag: 12345</w:t>
-            </w:r>
-          </w:p>
-          <w:p>
-            <w:pPr>
-              <w:pStyle w:val="Afsender"/>
-              <w:framePr w:wrap="auto" w:hAnchor="text" w:vAnchor="margin" w:xAlign="left" w:yAlign="inline"/>
-              <w:suppressOverlap w:val="0"/>
-              <w:rPr>
-                <w:rFonts w:cs="Arial"/>
-              </w:rPr>
-            </w:pPr>
-            <w:r>
-              <w:t xml:space="preserve">Dokumentnummer: </w:t>
-            </w:r>
-          </w:p>
-          <w:p>
-            <w:pPr>
-              <w:pStyle w:val="Normal"/>
-              <w:framePr w:wrap="auto" w:hAnchor="text" w:vAnchor="margin" w:xAlign="left" w:yAlign="inline"/>
-              <w:suppressOverlap w:val="0"/>
-              <w:rPr>
-                <w:rFonts w:cs="Arial"/>
-              </w:rPr>
-            </w:pPr>
-            <w:r>
-              <w:t>{{DOKUMENTNUMMER}}</w:t>
-            </w:r>
-          </w:p>
-          <w:p>
-            <w:pPr>
-              <w:pStyle w:val="Afsender"/>
-              <w:framePr w:wrap="auto" w:hAnchor="text" w:vAnchor="margin" w:xAlign="left" w:yAlign="inline"/>
-              <w:suppressOverlap w:val="0"/>
-              <w:rPr>
-                <w:rFonts w:cs="Arial"/>
-              </w:rPr>
-            </w:pPr>
-            <w:r/>
-          </w:p>
-          <w:p>
-            <w:pPr>
-              <w:pStyle w:val="Afsender"/>
-              <w:framePr w:wrap="auto" w:hAnchor="text" w:vAnchor="margin" w:xAlign="left" w:yAlign="inline"/>
-              <w:suppressOverlap w:val="0"/>
-              <w:rPr>
-                <w:rFonts w:cs="Arial"/>
-              </w:rPr>
-            </w:pPr>
-            <w:r>
-              <w:t>Sagsbehandler:</w:t>
-            </w:r>
-          </w:p>
-          <w:p>
-            <w:pPr>
-              <w:pStyle w:val="Normal"/>
-              <w:rPr>
-                <w:rFonts w:cs="Arial"/>
-              </w:rPr>
-            </w:pPr>
-            <w:r>
-              <w:t>Sofie Elrum</w:t>
-            </w:r>
-          </w:p>
-          <w:p>
-            <w:pPr>
-              <w:pStyle w:val="Afsender"/>
-              <w:framePr w:wrap="auto" w:hAnchor="text" w:vAnchor="margin" w:xAlign="left" w:yAlign="inline"/>
-              <w:suppressOverlap w:val="0"/>
-            </w:pPr>
-            <w:r/>
-          </w:p>
-        </w:tc>
-      </w:tr>
     </w:tbl>
     <w:p/>
-    <w:p/>
+    <w:p>
+      <w:pPr>
+        <w:spacing w:line="300" w:lineRule="atLeast"/>
+        <w:ind w:left="1304" w:hanging="1304"/>
+        <w:rPr>
+          <w:b/>
+          <w:bCs/>
+          <w:sz w:val="24"/>
+          <w:szCs w:val="28"/>
+        </w:rPr>
+      </w:pPr>
+    </w:p>
+    <w:p>
+      <w:pPr>
+        <w:spacing w:line="300" w:lineRule="atLeast"/>
+        <w:ind w:left="1304" w:hanging="1304"/>
+        <w:rPr>
+          <w:b/>
+          <w:bCs/>
+          <w:sz w:val="24"/>
+          <w:szCs w:val="28"/>
+        </w:rPr>
+      </w:pPr>
+    </w:p>
+    <w:p>
+      <w:pPr>
+        <w:spacing w:line="300" w:lineRule="atLeast"/>
+        <w:ind w:left="1304" w:hanging="1304"/>
+        <w:rPr>
+          <w:b/>
+          <w:bCs/>
+          <w:szCs w:val="20"/>
+        </w:rPr>
+      </w:pPr>
+      <w:r>
+        <w:rPr>
+          <w:b/>
+          <w:bCs/>
+          <w:szCs w:val="20"/>
+        </w:rPr>
+        <w:t xml:space="preserve">Afgørelse om bevilling af kørsel til </w:t>
+      </w:r>
+      <w:r>
+        <w:rPr>
+          <w:b/>
+          <w:bCs/>
+          <w:szCs w:val="20"/>
+        </w:rPr>
+        <w:t>Kasper Hansentest</w:t>
+      </w:r>
+      <w:r>
+        <w:rPr>
+          <w:b/>
+          <w:bCs/>
+          <w:szCs w:val="20"/>
+        </w:rPr>
+      </w:r>
+      <w:r>
+        <w:rPr>
+          <w:b/>
+          <w:bCs/>
+          <w:szCs w:val="20"/>
+        </w:rPr>
+      </w:r>
+    </w:p>
+    <w:p>
+      <w:pPr>
+        <w:spacing w:line="300" w:lineRule="atLeast"/>
+        <w:ind w:left="1304" w:hanging="1304"/>
+      </w:pPr>
+    </w:p>
     <w:p>
       <w:pPr>
         <w:spacing w:after="240"/>
@@ -912,24 +998,104 @@
         <w:rPr>
           <w:b/>
         </w:rPr>
-        <w:t xml:space="preserve">Regler </w:t>
+        <w:t xml:space="preserve">Klagevejledning </w:t>
+        <w:br/>
+      </w:r>
+      <w:r>
+        <w:t>Du kan ikke klage over kommunens afgørelse om befordring til en anden administrativ myndighed, jf. folkeskolelovens § 51, stk. 2 (LBK nr. 989 af 27/08/2024).</w:t>
+      </w:r>
+    </w:p>
+    <w:p>
+      <w:pPr>
+        <w:spacing w:after="240"/>
+      </w:pPr>
+      <w:r>
+        <w:t>Hvis du ønsker at klage over afgørelsen, kan du gøre det ved at besvare dette brev i din digitale postkasse eller sende en mail til befordring@mbu.aarhus.dk.</w:t>
+      </w:r>
+    </w:p>
+    <w:p>
+      <w:pPr>
+        <w:spacing w:after="240"/>
+      </w:pPr>
+      <w:r>
+        <w:t>Hvis du har spørgsmål til afgørelsen, kan du skrive til os via den digitale postkasse eller ved at sende en mail til befordring@mbu.aarhus.dk.</w:t>
+        <w:br/>
+        <w:t xml:space="preserve">  </w:t>
+        <w:br/>
+        <w:t xml:space="preserve">Du kan finde retsgrundlaget for afgørelsen sidst i dette brev.  </w:t>
+        <w:br/>
+        <w:t xml:space="preserve">  </w:t>
+        <w:br/>
+        <w:t xml:space="preserve">Med venlig hilsen </w:t>
+      </w:r>
+    </w:p>
+    <w:p>
+      <w:pPr>
+        <w:spacing w:after="240"/>
+      </w:pPr>
+      <w:r>
+        <w:rPr>
+          <w:color w:val="0F9ED5"/>
+        </w:rPr>
+        <w:t>Sofie Elrum</w:t>
+      </w:r>
+    </w:p>
+    <w:p>
+      <w:pPr>
+        <w:spacing w:after="240"/>
+      </w:pPr>
+      <w:r>
+        <w:rPr>
+          <w:b/>
+        </w:rPr>
+        <w:t>Regler</w:t>
         <w:br/>
       </w:r>
       <w:r>
         <w:t xml:space="preserve">Du kan finde de regler, som Budget og Regnskab har truffet afgørelsen efter i deres fulde længde her: </w:t>
         <w:br/>
-        <w:t xml:space="preserve">• Folkeskoleloven (retsinformation.dk) </w:t>
+        <w:t xml:space="preserve">• </w:t>
+      </w:r>
+      <w:hyperlink r:id="rId16">
+        <w:r>
+          <w:rPr>
+            <w:color w:val="0000FF"/>
+            <w:u w:val="single"/>
+          </w:rPr>
+          <w:t>Folkeskoleloven (retsinformation.dk)</w:t>
+        </w:r>
+      </w:hyperlink>
+      <w:r>
+        <w:t xml:space="preserve"> </w:t>
         <w:br/>
-        <w:t xml:space="preserve">• Bekendtgørelse om befordring af elever i folkeskolen (retsinformation.dk) </w:t>
-      </w:r>
-    </w:p>
-    <w:p>
-      <w:pPr>
-        <w:spacing w:after="240"/>
-      </w:pPr>
-      <w:r>
-        <w:t>Du kan læse om Børn og Unges behandling af dit barns og dine personoplysninger her: Behandling af personoplysninger i Børn og Unge (aarhus.dk)</w:t>
-      </w:r>
+        <w:t xml:space="preserve">• </w:t>
+      </w:r>
+      <w:hyperlink r:id="rId17">
+        <w:r>
+          <w:rPr>
+            <w:color w:val="0000FF"/>
+            <w:u w:val="single"/>
+          </w:rPr>
+          <w:t>Bekendtgørelse om befordring af elever i folkeskolen (retsinformation.dk)</w:t>
+        </w:r>
+      </w:hyperlink>
+    </w:p>
+    <w:p>
+      <w:pPr>
+        <w:spacing w:after="240"/>
+      </w:pPr>
+      <w:r>
+        <w:t xml:space="preserve">Du kan læse om Børn og Unges behandling af dit barns og dine personoplysninger her: </w:t>
+      </w:r>
+      <w:hyperlink r:id="rId18">
+        <w:r>
+          <w:rPr>
+            <w:color w:val="0000FF"/>
+            <w:u w:val="single"/>
+          </w:rPr>
+          <w:t>Behandling af personoplysninger i Børn og Unge (aarhus.dk)</w:t>
+        </w:r>
+      </w:hyperlink>
     </w:p>
     <w:p>
       <w:pPr>
@@ -1044,15 +1210,21 @@
         <w:t xml:space="preserve"> Beslutninger og afgørelser, som træffes af kommunalbestyrelsen vedrørende det kommunale skolevæsen, kan ikke indbringes for højere administrativ myndighed, jf. dog stk. 3-6. Børne- og undervisningsministeren kan fastsætte regler om, at andre afgørelser kan indbringes for ministeren.</w:t>
       </w:r>
     </w:p>
-    <w:p/>
+    <w:p>
+      <w:pPr>
+        <w:tabs>
+          <w:tab w:val="left" w:pos="2865"/>
+        </w:tabs>
+      </w:pPr>
+    </w:p>
     <w:sectPr>
       <w:headerReference w:type="default" r:id="rId9"/>
       <w:footerReference w:type="default" r:id="rId10"/>
       <w:headerReference w:type="first" r:id="rId11"/>
-      <w:pgSz w:w="11906" w:h="16838" w:orient="portrait" w:code="9"/>
+      <w:footerReference w:type="first" r:id="rId12"/>
+      <w:pgSz w:w="11906" w:h="16838" w:code="9"/>
       <w:pgMar w:top="1758" w:right="3686" w:bottom="1134" w:left="1418" w:header="709" w:footer="709" w:gutter="0"/>
       <w:cols w:space="708"/>
-      <w:titlePg/>
       <w:docGrid w:linePitch="360"/>
     </w:sectPr>
   </w:body>
@@ -1104,6 +1276,66 @@
 </w:ftr>
 </file>
 
+<file path=word/footer2.xml><?xml version="1.0" encoding="utf-8"?>
+<w:ftr xmlns:wpc="http://schemas.microsoft.com/office/word/2010/wordprocessingCanvas" xmlns:cx="http://schemas.microsoft.com/office/drawing/2014/chartex" xmlns:cx1="http://schemas.microsoft.com/office/drawing/2015/9/8/chartex" xmlns:cx2="http://schemas.microsoft.com/office/drawing/2015/10/21/chartex" xmlns:cx3="http://schemas.microsoft.com/office/drawing/2016/5/9/chartex" xmlns:cx4="http://schemas.microsoft.com/office/drawing/2016/5/10/chartex" xmlns:cx5="http://schemas.microsoft.com/office/drawing/2016/5/11/chartex" xmlns:cx6="http://schemas.microsoft.com/office/drawing/2016/5/12/chartex" xmlns:cx7="http://schemas.microsoft.com/office/drawing/2016/5/13/chartex" xmlns:cx8="http://schemas.microsoft.com/office/drawing/2016/5/14/chartex" xmlns:mc="http://schemas.openxmlformats.org/markup-compatibility/2006" xmlns:aink="http://schemas.microsoft.com/office/drawing/2016/ink" xmlns:am3d="http://schemas.microsoft.com/office/drawing/2017/model3d" xmlns:o="urn:schemas-microsoft-com:office:office" xmlns:oel="http://schemas.microsoft.com/office/2019/extlst" xmlns:r="http://schemas.openxmlformats.org/officeDocument/2006/relationships" xmlns:m="http://schemas.openxmlformats.org/officeDocument/2006/math" xmlns:v="urn:schemas-microsoft-com:vml" xmlns:wp14="http://schemas.microsoft.com/office/word/2010/wordprocessingDrawing" xmlns:wp="http://schemas.openxmlformats.org/drawingml/2006/wordprocessingDrawing" xmlns:w10="urn:schemas-microsoft-com:office:word" xmlns:w="http://schemas.openxmlformats.org/wordprocessingml/2006/main" xmlns:w14="http://schemas.microsoft.com/office/word/2010/wordml" xmlns:w15="http://schemas.microsoft.com/office/word/2012/wordml" xmlns:w16cex="http://schemas.microsoft.com/office/word/2018/wordml/cex" xmlns:w16cid="http://schemas.microsoft.com/office/word/2016/wordml/cid" xmlns:w16="http://schemas.microsoft.com/office/word/2018/wordml" xmlns:w16du="http://schemas.microsoft.com/office/word/2023/wordml/word16du" xmlns:w16sdtdh="http://schemas.microsoft.com/office/word/2020/wordml/sdtdatahash" xmlns:w16sdtfl="http://schemas.microsoft.com/office/word/2024/wordml/sdtformatlock" xmlns:w16se="http://schemas.microsoft.com/office/word/2015/wordml/symex" xmlns:wpg="http://schemas.microsoft.com/office/word/2010/wordprocessingGroup" xmlns:wpi="http://schemas.microsoft.com/office/word/2010/wordprocessingInk" xmlns:wne="http://schemas.microsoft.com/office/word/2006/wordml" xmlns:wps="http://schemas.microsoft.com/office/word/2010/wordprocessingShape" mc:Ignorable="w14 w15 w16se w16cid w16 w16cex w16sdtdh w16sdtfl w16du wp14">
+  <w:tbl>
+    <w:tblPr>
+      <w:tblW w:w="0" w:type="auto"/>
+      <w:tblLook w:val="06A0" w:firstRow="1" w:lastRow="0" w:firstColumn="1" w:lastColumn="0" w:noHBand="1" w:noVBand="1"/>
+    </w:tblPr>
+    <w:tblGrid>
+      <w:gridCol w:w="2265"/>
+      <w:gridCol w:w="2265"/>
+      <w:gridCol w:w="2265"/>
+    </w:tblGrid>
+    <w:tr>
+      <w:trPr>
+        <w:trHeight w:val="300"/>
+      </w:trPr>
+      <w:tc>
+        <w:tcPr>
+          <w:tcW w:w="2265" w:type="dxa"/>
+        </w:tcPr>
+        <w:p>
+          <w:pPr>
+            <w:pStyle w:val="Sidehoved"/>
+            <w:ind w:left="-115"/>
+          </w:pPr>
+        </w:p>
+      </w:tc>
+      <w:tc>
+        <w:tcPr>
+          <w:tcW w:w="2265" w:type="dxa"/>
+        </w:tcPr>
+        <w:p>
+          <w:pPr>
+            <w:pStyle w:val="Sidehoved"/>
+            <w:jc w:val="center"/>
+          </w:pPr>
+        </w:p>
+      </w:tc>
+      <w:tc>
+        <w:tcPr>
+          <w:tcW w:w="2265" w:type="dxa"/>
+        </w:tcPr>
+        <w:p>
+          <w:pPr>
+            <w:pStyle w:val="Sidehoved"/>
+            <w:ind w:right="-115"/>
+            <w:jc w:val="right"/>
+          </w:pPr>
+        </w:p>
+      </w:tc>
+    </w:tr>
+  </w:tbl>
+  <w:p>
+    <w:pPr>
+      <w:pStyle w:val="Sidefod"/>
+    </w:pPr>
+  </w:p>
+</w:ftr>
+</file>
+
 <file path=word/footnotes.xml><?xml version="1.0" encoding="utf-8"?>
 <w:footnotes xmlns:wpc="http://schemas.microsoft.com/office/word/2010/wordprocessingCanvas" xmlns:cx="http://schemas.microsoft.com/office/drawing/2014/chartex" xmlns:cx1="http://schemas.microsoft.com/office/drawing/2015/9/8/chartex" xmlns:cx2="http://schemas.microsoft.com/office/drawing/2015/10/21/chartex" xmlns:cx3="http://schemas.microsoft.com/office/drawing/2016/5/9/chartex" xmlns:cx4="http://schemas.microsoft.com/office/drawing/2016/5/10/chartex" xmlns:cx5="http://schemas.microsoft.com/office/drawing/2016/5/11/chartex" xmlns:cx6="http://schemas.microsoft.com/office/drawing/2016/5/12/chartex" xmlns:cx7="http://schemas.microsoft.com/office/drawing/2016/5/13/chartex" xmlns:cx8="http://schemas.microsoft.com/office/drawing/2016/5/14/chartex" xmlns:mc="http://schemas.openxmlformats.org/markup-compatibility/2006" xmlns:aink="http://schemas.microsoft.com/office/drawing/2016/ink" xmlns:am3d="http://schemas.microsoft.com/office/drawing/2017/model3d" xmlns:o="urn:schemas-microsoft-com:office:office" xmlns:oel="http://schemas.microsoft.com/office/2019/extlst" xmlns:r="http://schemas.openxmlformats.org/officeDocument/2006/relationships" xmlns:m="http://schemas.openxmlformats.org/officeDocument/2006/math" xmlns:v="urn:schemas-microsoft-com:vml" xmlns:wp14="http://schemas.microsoft.com/office/word/2010/wordprocessingDrawing" xmlns:wp="http://schemas.openxmlformats.org/drawingml/2006/wordprocessingDrawing" xmlns:w10="urn:schemas-microsoft-com:office:word" xmlns:w="http://schemas.openxmlformats.org/wordprocessingml/2006/main" xmlns:w14="http://schemas.microsoft.com/office/word/2010/wordml" xmlns:w15="http://schemas.microsoft.com/office/word/2012/wordml" xmlns:w16cex="http://schemas.microsoft.com/office/word/2018/wordml/cex" xmlns:w16cid="http://schemas.microsoft.com/office/word/2016/wordml/cid" xmlns:w16="http://schemas.microsoft.com/office/word/2018/wordml" xmlns:w16du="http://schemas.microsoft.com/office/word/2023/wordml/word16du" xmlns:w16sdtdh="http://schemas.microsoft.com/office/word/2020/wordml/sdtdatahash" xmlns:w16sdtfl="http://schemas.microsoft.com/office/word/2024/wordml/sdtformatlock" xmlns:w16se="http://schemas.microsoft.com/office/word/2015/wordml/symex" xmlns:wpg="http://schemas.microsoft.com/office/word/2010/wordprocessingGroup" xmlns:wpi="http://schemas.microsoft.com/office/word/2010/wordprocessingInk" xmlns:wne="http://schemas.microsoft.com/office/word/2006/wordml" xmlns:wps="http://schemas.microsoft.com/office/word/2010/wordprocessingShape" mc:Ignorable="w14 w15 w16se w16cid w16 w16cex w16sdtdh w16sdtfl w16du wp14">
   <w:footnote w:type="separator" w:id="-1">
@@ -1130,7 +1362,7 @@
 </file>
 
 <file path=word/header1.xml><?xml version="1.0" encoding="utf-8"?>
-<w:hdr xmlns:wpc="http://schemas.microsoft.com/office/word/2010/wordprocessingCanvas" xmlns:cx="http://schemas.microsoft.com/office/drawing/2014/chartex" xmlns:cx1="http://schemas.microsoft.com/office/drawing/2015/9/8/chartex" xmlns:cx2="http://schemas.microsoft.com/office/drawing/2015/10/21/chartex" xmlns:cx3="http://schemas.microsoft.com/office/drawing/2016/5/9/chartex" xmlns:cx4="http://schemas.microsoft.com/office/drawing/2016/5/10/chartex" xmlns:cx5="http://schemas.microsoft.com/office/drawing/2016/5/11/chartex" xmlns:cx6="http://schemas.microsoft.com/office/drawing/2016/5/12/chartex" xmlns:cx7="http://schemas.microsoft.com/office/drawing/2016/5/13/chartex" xmlns:cx8="http://schemas.microsoft.com/office/drawing/2016/5/14/chartex" xmlns:mc="http://schemas.openxmlformats.org/markup-compatibility/2006" xmlns:aink="http://schemas.microsoft.com/office/drawing/2016/ink" xmlns:am3d="http://schemas.microsoft.com/office/drawing/2017/model3d" xmlns:o="urn:schemas-microsoft-com:office:office" xmlns:oel="http://schemas.microsoft.com/office/2019/extlst" xmlns:r="http://schemas.openxmlformats.org/officeDocument/2006/relationships" xmlns:m="http://schemas.openxmlformats.org/officeDocument/2006/math" xmlns:v="urn:schemas-microsoft-com:vml" xmlns:wp14="http://schemas.microsoft.com/office/word/2010/wordprocessingDrawing" xmlns:wp="http://schemas.openxmlformats.org/drawingml/2006/wordprocessingDrawing" xmlns:w10="urn:schemas-microsoft-com:office:word" xmlns:w="http://schemas.openxmlformats.org/wordprocessingml/2006/main" xmlns:w14="http://schemas.microsoft.com/office/word/2010/wordml" xmlns:w15="http://schemas.microsoft.com/office/word/2012/wordml" xmlns:w16cex="http://schemas.microsoft.com/office/word/2018/wordml/cex" xmlns:w16cid="http://schemas.microsoft.com/office/word/2016/wordml/cid" xmlns:w16="http://schemas.microsoft.com/office/word/2018/wordml" xmlns:w16du="http://schemas.microsoft.com/office/word/2023/wordml/word16du" xmlns:w16sdtdh="http://schemas.microsoft.com/office/word/2020/wordml/sdtdatahash" xmlns:w16sdtfl="http://schemas.microsoft.com/office/word/2024/wordml/sdtformatlock" xmlns:w16se="http://schemas.microsoft.com/office/word/2015/wordml/symex" xmlns:wpg="http://schemas.microsoft.com/office/word/2010/wordprocessingGroup" xmlns:wpi="http://schemas.microsoft.com/office/word/2010/wordprocessingInk" xmlns:wne="http://schemas.microsoft.com/office/word/2006/wordml" xmlns:wps="http://schemas.microsoft.com/office/word/2010/wordprocessingShape" xmlns:a="http://schemas.openxmlformats.org/drawingml/2006/main" xmlns:pic="http://schemas.openxmlformats.org/drawingml/2006/picture" xmlns:a14="http://schemas.microsoft.com/office/drawing/2010/main" mc:Ignorable="w14 w15 w16se w16cid w16 w16cex w16sdtdh w16sdtfl w16du wp14">
+<w:hdr xmlns:wpc="http://schemas.microsoft.com/office/word/2010/wordprocessingCanvas" xmlns:cx="http://schemas.microsoft.com/office/drawing/2014/chartex" xmlns:cx1="http://schemas.microsoft.com/office/drawing/2015/9/8/chartex" xmlns:cx2="http://schemas.microsoft.com/office/drawing/2015/10/21/chartex" xmlns:cx3="http://schemas.microsoft.com/office/drawing/2016/5/9/chartex" xmlns:cx4="http://schemas.microsoft.com/office/drawing/2016/5/10/chartex" xmlns:cx5="http://schemas.microsoft.com/office/drawing/2016/5/11/chartex" xmlns:cx6="http://schemas.microsoft.com/office/drawing/2016/5/12/chartex" xmlns:cx7="http://schemas.microsoft.com/office/drawing/2016/5/13/chartex" xmlns:cx8="http://schemas.microsoft.com/office/drawing/2016/5/14/chartex" xmlns:mc="http://schemas.openxmlformats.org/markup-compatibility/2006" xmlns:aink="http://schemas.microsoft.com/office/drawing/2016/ink" xmlns:am3d="http://schemas.microsoft.com/office/drawing/2017/model3d" xmlns:o="urn:schemas-microsoft-com:office:office" xmlns:oel="http://schemas.microsoft.com/office/2019/extlst" xmlns:r="http://schemas.openxmlformats.org/officeDocument/2006/relationships" xmlns:m="http://schemas.openxmlformats.org/officeDocument/2006/math" xmlns:v="urn:schemas-microsoft-com:vml" xmlns:wp14="http://schemas.microsoft.com/office/word/2010/wordprocessingDrawing" xmlns:wp="http://schemas.openxmlformats.org/drawingml/2006/wordprocessingDrawing" xmlns:w10="urn:schemas-microsoft-com:office:word" xmlns:w="http://schemas.openxmlformats.org/wordprocessingml/2006/main" xmlns:w14="http://schemas.microsoft.com/office/word/2010/wordml" xmlns:w15="http://schemas.microsoft.com/office/word/2012/wordml" xmlns:w16cex="http://schemas.microsoft.com/office/word/2018/wordml/cex" xmlns:w16cid="http://schemas.microsoft.com/office/word/2016/wordml/cid" xmlns:w16="http://schemas.microsoft.com/office/word/2018/wordml" xmlns:w16du="http://schemas.microsoft.com/office/word/2023/wordml/word16du" xmlns:w16sdtdh="http://schemas.microsoft.com/office/word/2020/wordml/sdtdatahash" xmlns:w16sdtfl="http://schemas.microsoft.com/office/word/2024/wordml/sdtformatlock" xmlns:w16se="http://schemas.microsoft.com/office/word/2015/wordml/symex" xmlns:wpg="http://schemas.microsoft.com/office/word/2010/wordprocessingGroup" xmlns:wpi="http://schemas.microsoft.com/office/word/2010/wordprocessingInk" xmlns:wne="http://schemas.microsoft.com/office/word/2006/wordml" xmlns:wps="http://schemas.microsoft.com/office/word/2010/wordprocessingShape" mc:Ignorable="w14 w15 w16se w16cid w16 w16cex w16sdtdh w16sdtfl w16du wp14">
   <w:tbl>
     <w:tblPr>
       <w:tblStyle w:val="Tabel-Gitter"/>
@@ -1138,12 +1370,12 @@
       <w:tblOverlap w:val="never"/>
       <w:tblW w:w="0" w:type="auto"/>
       <w:tblBorders>
-        <w:top w:val="none" w:color="auto" w:sz="0" w:space="0"/>
-        <w:left w:val="none" w:color="auto" w:sz="0" w:space="0"/>
-        <w:bottom w:val="none" w:color="auto" w:sz="0" w:space="0"/>
-        <w:right w:val="none" w:color="auto" w:sz="0" w:space="0"/>
-        <w:insideH w:val="none" w:color="auto" w:sz="0" w:space="0"/>
-        <w:insideV w:val="none" w:color="auto" w:sz="0" w:space="0"/>
+        <w:top w:val="none" w:sz="0" w:space="0" w:color="auto"/>
+        <w:left w:val="none" w:sz="0" w:space="0" w:color="auto"/>
+        <w:bottom w:val="none" w:sz="0" w:space="0" w:color="auto"/>
+        <w:right w:val="none" w:sz="0" w:space="0" w:color="auto"/>
+        <w:insideH w:val="none" w:sz="0" w:space="0" w:color="auto"/>
+        <w:insideV w:val="none" w:sz="0" w:space="0" w:color="auto"/>
       </w:tblBorders>
       <w:tblCellMar>
         <w:left w:w="0" w:type="dxa"/>
@@ -1169,13 +1401,13 @@
             <w:rPr>
               <w:rFonts w:cs="Arial"/>
             </w:rPr>
-            <w:t>17. marts 2026</w:t>
+            <w:t>2026-03-27</w:t>
           </w:r>
         </w:p>
         <w:p>
           <w:pPr>
             <w:pStyle w:val="Afsender"/>
-            <w:framePr w:wrap="auto" w:hAnchor="text" w:vAnchor="margin" w:xAlign="left" w:yAlign="inline"/>
+            <w:framePr w:wrap="auto" w:vAnchor="margin" w:hAnchor="text" w:xAlign="left" w:yAlign="inline"/>
             <w:suppressOverlap w:val="0"/>
           </w:pPr>
           <w:r>
@@ -1264,7 +1496,7 @@
         <w:noProof/>
       </w:rPr>
       <w:drawing>
-        <wp:anchor distT="0" distB="0" distL="114300" distR="114300" simplePos="0" relativeHeight="251659264" behindDoc="1" locked="0" layoutInCell="1" allowOverlap="1" wp14:anchorId="20C7EFFD" wp14:editId="1B0EB87F">
+        <wp:anchor distT="0" distB="0" distL="114300" distR="114300" simplePos="0" relativeHeight="251658241" behindDoc="1" locked="0" layoutInCell="1" allowOverlap="1" wp14:anchorId="20C7EFFD" wp14:editId="1B0EB87F">
           <wp:simplePos x="0" y="0"/>
           <wp:positionH relativeFrom="page">
             <wp:posOffset>5471795</wp:posOffset>
@@ -1316,7 +1548,7 @@
 </file>
 
 <file path=word/header2.xml><?xml version="1.0" encoding="utf-8"?>
-<w:hdr xmlns:wpc="http://schemas.microsoft.com/office/word/2010/wordprocessingCanvas" xmlns:cx="http://schemas.microsoft.com/office/drawing/2014/chartex" xmlns:cx1="http://schemas.microsoft.com/office/drawing/2015/9/8/chartex" xmlns:cx2="http://schemas.microsoft.com/office/drawing/2015/10/21/chartex" xmlns:cx3="http://schemas.microsoft.com/office/drawing/2016/5/9/chartex" xmlns:cx4="http://schemas.microsoft.com/office/drawing/2016/5/10/chartex" xmlns:cx5="http://schemas.microsoft.com/office/drawing/2016/5/11/chartex" xmlns:cx6="http://schemas.microsoft.com/office/drawing/2016/5/12/chartex" xmlns:cx7="http://schemas.microsoft.com/office/drawing/2016/5/13/chartex" xmlns:cx8="http://schemas.microsoft.com/office/drawing/2016/5/14/chartex" xmlns:mc="http://schemas.openxmlformats.org/markup-compatibility/2006" xmlns:aink="http://schemas.microsoft.com/office/drawing/2016/ink" xmlns:am3d="http://schemas.microsoft.com/office/drawing/2017/model3d" xmlns:o="urn:schemas-microsoft-com:office:office" xmlns:oel="http://schemas.microsoft.com/office/2019/extlst" xmlns:r="http://schemas.openxmlformats.org/officeDocument/2006/relationships" xmlns:m="http://schemas.openxmlformats.org/officeDocument/2006/math" xmlns:v="urn:schemas-microsoft-com:vml" xmlns:wp14="http://schemas.microsoft.com/office/word/2010/wordprocessingDrawing" xmlns:wp="http://schemas.openxmlformats.org/drawingml/2006/wordprocessingDrawing" xmlns:w10="urn:schemas-microsoft-com:office:word" xmlns:w="http://schemas.openxmlformats.org/wordprocessingml/2006/main" xmlns:w14="http://schemas.microsoft.com/office/word/2010/wordml" xmlns:w15="http://schemas.microsoft.com/office/word/2012/wordml" xmlns:w16cex="http://schemas.microsoft.com/office/word/2018/wordml/cex" xmlns:w16cid="http://schemas.microsoft.com/office/word/2016/wordml/cid" xmlns:w16="http://schemas.microsoft.com/office/word/2018/wordml" xmlns:w16du="http://schemas.microsoft.com/office/word/2023/wordml/word16du" xmlns:w16sdtdh="http://schemas.microsoft.com/office/word/2020/wordml/sdtdatahash" xmlns:w16sdtfl="http://schemas.microsoft.com/office/word/2024/wordml/sdtformatlock" xmlns:w16se="http://schemas.microsoft.com/office/word/2015/wordml/symex" xmlns:wpg="http://schemas.microsoft.com/office/word/2010/wordprocessingGroup" xmlns:wpi="http://schemas.microsoft.com/office/word/2010/wordprocessingInk" xmlns:wne="http://schemas.microsoft.com/office/word/2006/wordml" xmlns:wps="http://schemas.microsoft.com/office/word/2010/wordprocessingShape" xmlns:a="http://schemas.openxmlformats.org/drawingml/2006/main" xmlns:pic="http://schemas.openxmlformats.org/drawingml/2006/picture" xmlns:a14="http://schemas.microsoft.com/office/drawing/2010/main" mc:Ignorable="w14 w15 w16se w16cid w16 w16cex w16sdtdh w16sdtfl w16du wp14">
+<w:hdr xmlns:wpc="http://schemas.microsoft.com/office/word/2010/wordprocessingCanvas" xmlns:cx="http://schemas.microsoft.com/office/drawing/2014/chartex" xmlns:cx1="http://schemas.microsoft.com/office/drawing/2015/9/8/chartex" xmlns:cx2="http://schemas.microsoft.com/office/drawing/2015/10/21/chartex" xmlns:cx3="http://schemas.microsoft.com/office/drawing/2016/5/9/chartex" xmlns:cx4="http://schemas.microsoft.com/office/drawing/2016/5/10/chartex" xmlns:cx5="http://schemas.microsoft.com/office/drawing/2016/5/11/chartex" xmlns:cx6="http://schemas.microsoft.com/office/drawing/2016/5/12/chartex" xmlns:cx7="http://schemas.microsoft.com/office/drawing/2016/5/13/chartex" xmlns:cx8="http://schemas.microsoft.com/office/drawing/2016/5/14/chartex" xmlns:mc="http://schemas.openxmlformats.org/markup-compatibility/2006" xmlns:aink="http://schemas.microsoft.com/office/drawing/2016/ink" xmlns:am3d="http://schemas.microsoft.com/office/drawing/2017/model3d" xmlns:o="urn:schemas-microsoft-com:office:office" xmlns:oel="http://schemas.microsoft.com/office/2019/extlst" xmlns:r="http://schemas.openxmlformats.org/officeDocument/2006/relationships" xmlns:m="http://schemas.openxmlformats.org/officeDocument/2006/math" xmlns:v="urn:schemas-microsoft-com:vml" xmlns:wp14="http://schemas.microsoft.com/office/word/2010/wordprocessingDrawing" xmlns:wp="http://schemas.openxmlformats.org/drawingml/2006/wordprocessingDrawing" xmlns:w10="urn:schemas-microsoft-com:office:word" xmlns:w="http://schemas.openxmlformats.org/wordprocessingml/2006/main" xmlns:w14="http://schemas.microsoft.com/office/word/2010/wordml" xmlns:w15="http://schemas.microsoft.com/office/word/2012/wordml" xmlns:w16cex="http://schemas.microsoft.com/office/word/2018/wordml/cex" xmlns:w16cid="http://schemas.microsoft.com/office/word/2016/wordml/cid" xmlns:w16="http://schemas.microsoft.com/office/word/2018/wordml" xmlns:w16du="http://schemas.microsoft.com/office/word/2023/wordml/word16du" xmlns:w16sdtdh="http://schemas.microsoft.com/office/word/2020/wordml/sdtdatahash" xmlns:w16sdtfl="http://schemas.microsoft.com/office/word/2024/wordml/sdtformatlock" xmlns:w16se="http://schemas.microsoft.com/office/word/2015/wordml/symex" xmlns:wpg="http://schemas.microsoft.com/office/word/2010/wordprocessingGroup" xmlns:wpi="http://schemas.microsoft.com/office/word/2010/wordprocessingInk" xmlns:wne="http://schemas.microsoft.com/office/word/2006/wordml" xmlns:wps="http://schemas.microsoft.com/office/word/2010/wordprocessingShape" mc:Ignorable="w14 w15 w16se w16cid w16 w16cex w16sdtdh w16sdtfl w16du wp14">
   <w:tbl>
     <w:tblPr>
       <w:tblStyle w:val="Tabel-Gitter"/>
@@ -1324,12 +1556,12 @@
       <w:tblOverlap w:val="never"/>
       <w:tblW w:w="0" w:type="auto"/>
       <w:tblBorders>
-        <w:top w:val="none" w:color="auto" w:sz="0" w:space="0"/>
-        <w:left w:val="none" w:color="auto" w:sz="0" w:space="0"/>
-        <w:bottom w:val="none" w:color="auto" w:sz="0" w:space="0"/>
-        <w:right w:val="none" w:color="auto" w:sz="0" w:space="0"/>
-        <w:insideH w:val="none" w:color="auto" w:sz="0" w:space="0"/>
-        <w:insideV w:val="none" w:color="auto" w:sz="0" w:space="0"/>
+        <w:top w:val="none" w:sz="0" w:space="0" w:color="auto"/>
+        <w:left w:val="none" w:sz="0" w:space="0" w:color="auto"/>
+        <w:bottom w:val="none" w:sz="0" w:space="0" w:color="auto"/>
+        <w:right w:val="none" w:sz="0" w:space="0" w:color="auto"/>
+        <w:insideH w:val="none" w:sz="0" w:space="0" w:color="auto"/>
+        <w:insideV w:val="none" w:sz="0" w:space="0" w:color="auto"/>
       </w:tblBorders>
       <w:tblCellMar>
         <w:left w:w="0" w:type="dxa"/>
@@ -1351,11 +1583,24 @@
           <w:tcW w:w="2948" w:type="dxa"/>
         </w:tcPr>
         <w:p>
+          <w:pPr>
+            <w:rPr>
+              <w:rFonts w:eastAsia="Arial" w:cs="Arial"/>
+              <w:szCs w:val="20"/>
+            </w:rPr>
+          </w:pPr>
           <w:r>
             <w:rPr>
               <w:rFonts w:cs="Arial"/>
             </w:rPr>
-            <w:t>17. marts 2026</w:t>
+            <w:t>2026-03-27</w:t>
+          </w:r>
+          <w:r>
+            <w:rPr>
+              <w:rFonts w:eastAsia="Arial" w:cs="Arial"/>
+              <w:szCs w:val="20"/>
+              <w:lang w:val="da"/>
+            </w:rPr>
           </w:r>
         </w:p>
         <w:p>
@@ -1395,21 +1640,11 @@
           <w:r>
             <w:t xml:space="preserve"> </w:t>
           </w:r>
-          <w:r>
-            <w:fldChar w:fldCharType="begin"/>
-          </w:r>
-          <w:r>
-            <w:instrText> NUMPAGES   \* MERGEFORMAT </w:instrText>
-          </w:r>
-          <w:r>
-            <w:fldChar w:fldCharType="separate"/>
-          </w:r>
-          <w:r>
-            <w:t>1</w:t>
-          </w:r>
-          <w:r>
-            <w:fldChar w:fldCharType="end"/>
-          </w:r>
+          <w:fldSimple w:instr="NUMPAGES   \* MERGEFORMAT">
+            <w:r>
+              <w:t>1</w:t>
+            </w:r>
+          </w:fldSimple>
         </w:p>
       </w:tc>
     </w:tr>
@@ -1423,7 +1658,7 @@
         <w:noProof/>
       </w:rPr>
       <w:drawing>
-        <wp:anchor distT="0" distB="0" distL="114300" distR="114300" simplePos="0" relativeHeight="251658240" behindDoc="1" locked="0" layoutInCell="1" allowOverlap="1" wp14:anchorId="248EF54F" wp14:editId="0A5F58E5">
+        <wp:anchor distT="0" distB="0" distL="114300" distR="114300" simplePos="0" relativeHeight="251658240" behindDoc="1" locked="0" layoutInCell="1" allowOverlap="1" wp14:anchorId="248EF54F" wp14:editId="6F25B1BE">
           <wp:simplePos x="0" y="0"/>
           <wp:positionH relativeFrom="page">
             <wp:posOffset>5471795</wp:posOffset>
@@ -1474,12 +1709,24 @@
 </w:hdr>
 </file>
 
+<file path=word/intelligence2.xml><?xml version="1.0" encoding="utf-8"?>
+<int2:intelligence xmlns:int2="http://schemas.microsoft.com/office/intelligence/2020/intelligence" xmlns:oel="http://schemas.microsoft.com/office/2019/extlst">
+  <int2:observations>
+    <int2:textHash int2:hashCode="c8HQoiABZXvd2K" int2:id="H9mr4que">
+      <int2:state int2:value="Rejected" int2:type="spell"/>
+    </int2:textHash>
+  </int2:observations>
+  <int2:intelligenceSettings/>
+  <int2:onDemandWorkflows/>
+</int2:intelligence>
+</file>
+
 <file path=word/styles.xml><?xml version="1.0" encoding="utf-8"?>
-<w:styles xmlns:wp14="http://schemas.microsoft.com/office/word/2010/wordprocessingDrawing" xmlns:mc="http://schemas.openxmlformats.org/markup-compatibility/2006" xmlns:r="http://schemas.openxmlformats.org/officeDocument/2006/relationships" xmlns:w="http://schemas.openxmlformats.org/wordprocessingml/2006/main" xmlns:w14="http://schemas.microsoft.com/office/word/2010/wordml" xmlns:w15="http://schemas.microsoft.com/office/word/2012/wordml" xmlns:w16cex="http://schemas.microsoft.com/office/word/2018/wordml/cex" xmlns:w16cid="http://schemas.microsoft.com/office/word/2016/wordml/cid" xmlns:w16="http://schemas.microsoft.com/office/word/2018/wordml" xmlns:w16du="http://schemas.microsoft.com/office/word/2023/wordml/word16du" xmlns:w16sdtdh="http://schemas.microsoft.com/office/word/2020/wordml/sdtdatahash" xmlns:w16sdtfl="http://schemas.microsoft.com/office/word/2024/wordml/sdtformatlock" xmlns:w16se="http://schemas.microsoft.com/office/word/2015/wordml/symex" mc:Ignorable="w14 w15 w16se w16cid w16 w16cex w16sdtdh w16sdtfl w16du wp14">
+<w:styles xmlns:mc="http://schemas.openxmlformats.org/markup-compatibility/2006" xmlns:r="http://schemas.openxmlformats.org/officeDocument/2006/relationships" xmlns:w="http://schemas.openxmlformats.org/wordprocessingml/2006/main" xmlns:w14="http://schemas.microsoft.com/office/word/2010/wordml" xmlns:w15="http://schemas.microsoft.com/office/word/2012/wordml" xmlns:w16cex="http://schemas.microsoft.com/office/word/2018/wordml/cex" xmlns:w16cid="http://schemas.microsoft.com/office/word/2016/wordml/cid" xmlns:w16="http://schemas.microsoft.com/office/word/2018/wordml" xmlns:w16du="http://schemas.microsoft.com/office/word/2023/wordml/word16du" xmlns:w16sdtdh="http://schemas.microsoft.com/office/word/2020/wordml/sdtdatahash" xmlns:w16sdtfl="http://schemas.microsoft.com/office/word/2024/wordml/sdtformatlock" xmlns:w16se="http://schemas.microsoft.com/office/word/2015/wordml/symex" mc:Ignorable="w14 w15 w16se w16cid w16 w16cex w16sdtdh w16sdtfl w16du">
   <w:docDefaults>
     <w:rPrDefault>
       <w:rPr>
-        <w:rFonts w:ascii="Verdana" w:hAnsi="Verdana" w:eastAsiaTheme="minorHAnsi" w:cstheme="minorBidi"/>
+        <w:rFonts w:ascii="Verdana" w:eastAsiaTheme="minorHAnsi" w:hAnsi="Verdana" w:cstheme="minorBidi"/>
         <w:szCs w:val="22"/>
         <w:lang w:val="da-DK" w:eastAsia="en-US" w:bidi="ar-SA"/>
       </w:rPr>
@@ -1493,14 +1740,14 @@
   <w:latentStyles w:defLockedState="0" w:defUIPriority="99" w:defSemiHidden="0" w:defUnhideWhenUsed="0" w:defQFormat="0" w:count="376">
     <w:lsdException w:name="Normal" w:uiPriority="0" w:qFormat="1"/>
     <w:lsdException w:name="heading 1" w:uiPriority="9" w:qFormat="1"/>
-    <w:lsdException w:name="heading 2" w:uiPriority="9" w:semiHidden="1" w:unhideWhenUsed="1" w:qFormat="1"/>
-    <w:lsdException w:name="heading 3" w:uiPriority="9" w:semiHidden="1" w:unhideWhenUsed="1" w:qFormat="1"/>
-    <w:lsdException w:name="heading 4" w:uiPriority="9" w:semiHidden="1" w:unhideWhenUsed="1"/>
-    <w:lsdException w:name="heading 5" w:uiPriority="9" w:semiHidden="1" w:unhideWhenUsed="1" w:qFormat="1"/>
-    <w:lsdException w:name="heading 6" w:uiPriority="9" w:semiHidden="1" w:unhideWhenUsed="1" w:qFormat="1"/>
-    <w:lsdException w:name="heading 7" w:uiPriority="9" w:semiHidden="1" w:unhideWhenUsed="1" w:qFormat="1"/>
-    <w:lsdException w:name="heading 8" w:uiPriority="9" w:semiHidden="1" w:unhideWhenUsed="1" w:qFormat="1"/>
-    <w:lsdException w:name="heading 9" w:uiPriority="9" w:semiHidden="1" w:unhideWhenUsed="1" w:qFormat="1"/>
+    <w:lsdException w:name="heading 2" w:semiHidden="1" w:uiPriority="9" w:unhideWhenUsed="1" w:qFormat="1"/>
+    <w:lsdException w:name="heading 3" w:semiHidden="1" w:uiPriority="9" w:unhideWhenUsed="1" w:qFormat="1"/>
+    <w:lsdException w:name="heading 4" w:semiHidden="1" w:uiPriority="9" w:unhideWhenUsed="1"/>
+    <w:lsdException w:name="heading 5" w:semiHidden="1" w:uiPriority="9" w:unhideWhenUsed="1" w:qFormat="1"/>
+    <w:lsdException w:name="heading 6" w:semiHidden="1" w:uiPriority="9" w:unhideWhenUsed="1" w:qFormat="1"/>
+    <w:lsdException w:name="heading 7" w:semiHidden="1" w:uiPriority="9" w:unhideWhenUsed="1" w:qFormat="1"/>
+    <w:lsdException w:name="heading 8" w:semiHidden="1" w:uiPriority="9" w:unhideWhenUsed="1" w:qFormat="1"/>
+    <w:lsdException w:name="heading 9" w:semiHidden="1" w:uiPriority="9" w:unhideWhenUsed="1" w:qFormat="1"/>
     <w:lsdException w:name="index 1" w:semiHidden="1" w:unhideWhenUsed="1"/>
     <w:lsdException w:name="index 2" w:semiHidden="1" w:unhideWhenUsed="1"/>
     <w:lsdException w:name="index 3" w:semiHidden="1" w:unhideWhenUsed="1"/>
@@ -1510,22 +1757,22 @@
     <w:lsdException w:name="index 7" w:semiHidden="1" w:unhideWhenUsed="1"/>
     <w:lsdException w:name="index 8" w:semiHidden="1" w:unhideWhenUsed="1"/>
     <w:lsdException w:name="index 9" w:semiHidden="1" w:unhideWhenUsed="1"/>
-    <w:lsdException w:name="toc 1" w:uiPriority="39" w:semiHidden="1" w:unhideWhenUsed="1"/>
-    <w:lsdException w:name="toc 2" w:uiPriority="39" w:semiHidden="1" w:unhideWhenUsed="1"/>
-    <w:lsdException w:name="toc 3" w:uiPriority="39" w:semiHidden="1" w:unhideWhenUsed="1"/>
-    <w:lsdException w:name="toc 4" w:uiPriority="39" w:semiHidden="1" w:unhideWhenUsed="1"/>
-    <w:lsdException w:name="toc 5" w:uiPriority="39" w:semiHidden="1" w:unhideWhenUsed="1"/>
-    <w:lsdException w:name="toc 6" w:uiPriority="39" w:semiHidden="1" w:unhideWhenUsed="1"/>
-    <w:lsdException w:name="toc 7" w:uiPriority="39" w:semiHidden="1" w:unhideWhenUsed="1"/>
-    <w:lsdException w:name="toc 8" w:uiPriority="39" w:semiHidden="1" w:unhideWhenUsed="1"/>
-    <w:lsdException w:name="toc 9" w:uiPriority="39" w:semiHidden="1" w:unhideWhenUsed="1"/>
+    <w:lsdException w:name="toc 1" w:semiHidden="1" w:uiPriority="39" w:unhideWhenUsed="1"/>
+    <w:lsdException w:name="toc 2" w:semiHidden="1" w:uiPriority="39" w:unhideWhenUsed="1"/>
+    <w:lsdException w:name="toc 3" w:semiHidden="1" w:uiPriority="39" w:unhideWhenUsed="1"/>
+    <w:lsdException w:name="toc 4" w:semiHidden="1" w:uiPriority="39" w:unhideWhenUsed="1"/>
+    <w:lsdException w:name="toc 5" w:semiHidden="1" w:uiPriority="39" w:unhideWhenUsed="1"/>
+    <w:lsdException w:name="toc 6" w:semiHidden="1" w:uiPriority="39" w:unhideWhenUsed="1"/>
+    <w:lsdException w:name="toc 7" w:semiHidden="1" w:uiPriority="39" w:unhideWhenUsed="1"/>
+    <w:lsdException w:name="toc 8" w:semiHidden="1" w:uiPriority="39" w:unhideWhenUsed="1"/>
+    <w:lsdException w:name="toc 9" w:semiHidden="1" w:uiPriority="39" w:unhideWhenUsed="1"/>
     <w:lsdException w:name="Normal Indent" w:semiHidden="1" w:unhideWhenUsed="1"/>
     <w:lsdException w:name="footnote text" w:semiHidden="1" w:unhideWhenUsed="1"/>
     <w:lsdException w:name="annotation text" w:semiHidden="1" w:unhideWhenUsed="1"/>
     <w:lsdException w:name="header" w:semiHidden="1" w:unhideWhenUsed="1"/>
     <w:lsdException w:name="footer" w:semiHidden="1" w:unhideWhenUsed="1"/>
     <w:lsdException w:name="index heading" w:semiHidden="1" w:unhideWhenUsed="1"/>
-    <w:lsdException w:name="caption" w:uiPriority="35" w:semiHidden="1" w:unhideWhenUsed="1" w:qFormat="1"/>
+    <w:lsdException w:name="caption" w:semiHidden="1" w:uiPriority="35" w:unhideWhenUsed="1" w:qFormat="1"/>
     <w:lsdException w:name="table of figures" w:semiHidden="1" w:unhideWhenUsed="1"/>
     <w:lsdException w:name="envelope address" w:semiHidden="1" w:unhideWhenUsed="1"/>
     <w:lsdException w:name="envelope return" w:semiHidden="1" w:unhideWhenUsed="1"/>
@@ -1556,7 +1803,7 @@
     <w:lsdException w:name="Title" w:uiPriority="10"/>
     <w:lsdException w:name="Closing" w:semiHidden="1" w:unhideWhenUsed="1"/>
     <w:lsdException w:name="Signature" w:semiHidden="1" w:unhideWhenUsed="1"/>
-    <w:lsdException w:name="Default Paragraph Font" w:uiPriority="1" w:semiHidden="1" w:unhideWhenUsed="1"/>
+    <w:lsdException w:name="Default Paragraph Font" w:semiHidden="1" w:uiPriority="1" w:unhideWhenUsed="1"/>
     <w:lsdException w:name="Body Text" w:semiHidden="1" w:unhideWhenUsed="1"/>
     <w:lsdException w:name="Body Text Indent" w:semiHidden="1" w:unhideWhenUsed="1"/>
     <w:lsdException w:name="List Continue" w:semiHidden="1" w:unhideWhenUsed="1"/>
@@ -1756,8 +2003,8 @@
     <w:lsdException w:name="Subtle Reference" w:uiPriority="31"/>
     <w:lsdException w:name="Intense Reference" w:uiPriority="32"/>
     <w:lsdException w:name="Book Title" w:uiPriority="33"/>
-    <w:lsdException w:name="Bibliography" w:uiPriority="37" w:semiHidden="1" w:unhideWhenUsed="1"/>
-    <w:lsdException w:name="TOC Heading" w:uiPriority="39" w:semiHidden="1" w:unhideWhenUsed="1" w:qFormat="1"/>
+    <w:lsdException w:name="Bibliography" w:semiHidden="1" w:uiPriority="37" w:unhideWhenUsed="1"/>
+    <w:lsdException w:name="TOC Heading" w:semiHidden="1" w:uiPriority="39" w:unhideWhenUsed="1" w:qFormat="1"/>
     <w:lsdException w:name="Plain Table 1" w:uiPriority="41"/>
     <w:lsdException w:name="Plain Table 2" w:uiPriority="42"/>
     <w:lsdException w:name="Plain Table 3" w:uiPriority="43"/>
@@ -1868,7 +2115,7 @@
     <w:lsdException w:name="Unresolved Mention" w:semiHidden="1" w:unhideWhenUsed="1"/>
     <w:lsdException w:name="Smart Link" w:semiHidden="1" w:unhideWhenUsed="1"/>
   </w:latentStyles>
-  <w:style w:type="paragraph" w:styleId="Normal" w:default="1">
+  <w:style w:type="paragraph" w:default="1" w:styleId="Normal">
     <w:name w:val="Normal"/>
     <w:qFormat/>
     <w:rsid w:val="000511D5"/>
@@ -1936,13 +2183,13 @@
       <w:bCs/>
     </w:rPr>
   </w:style>
-  <w:style w:type="character" w:styleId="Standardskrifttypeiafsnit" w:default="1">
+  <w:style w:type="character" w:default="1" w:styleId="Standardskrifttypeiafsnit">
     <w:name w:val="Default Paragraph Font"/>
     <w:uiPriority w:val="1"/>
     <w:semiHidden/>
     <w:unhideWhenUsed/>
   </w:style>
-  <w:style w:type="table" w:styleId="Tabel-Normal" w:default="1">
+  <w:style w:type="table" w:default="1" w:styleId="Tabel-Normal">
     <w:name w:val="Normal Table"/>
     <w:uiPriority w:val="99"/>
     <w:semiHidden/>
@@ -1957,13 +2204,13 @@
       </w:tblCellMar>
     </w:tblPr>
   </w:style>
-  <w:style w:type="numbering" w:styleId="Ingenoversigt" w:default="1">
+  <w:style w:type="numbering" w:default="1" w:styleId="Ingenoversigt">
     <w:name w:val="No List"/>
     <w:uiPriority w:val="99"/>
     <w:semiHidden/>
     <w:unhideWhenUsed/>
   </w:style>
-  <w:style w:type="character" w:styleId="Overskrift1Tegn" w:customStyle="1">
+  <w:style w:type="character" w:customStyle="1" w:styleId="Overskrift1Tegn">
     <w:name w:val="Overskrift 1 Tegn"/>
     <w:basedOn w:val="Standardskrifttypeiafsnit"/>
     <w:link w:val="Overskrift1"/>
@@ -1975,27 +2222,27 @@
       <w:sz w:val="22"/>
     </w:rPr>
   </w:style>
-  <w:style w:type="character" w:styleId="Overskrift2Tegn" w:customStyle="1">
+  <w:style w:type="character" w:customStyle="1" w:styleId="Overskrift2Tegn">
     <w:name w:val="Overskrift 2 Tegn"/>
     <w:basedOn w:val="Standardskrifttypeiafsnit"/>
     <w:link w:val="Overskrift2"/>
     <w:uiPriority w:val="9"/>
     <w:rsid w:val="003B2888"/>
     <w:rPr>
-      <w:rFonts w:ascii="Arial" w:hAnsi="Arial" w:eastAsiaTheme="majorEastAsia" w:cstheme="majorBidi"/>
+      <w:rFonts w:ascii="Arial" w:eastAsiaTheme="majorEastAsia" w:hAnsi="Arial" w:cstheme="majorBidi"/>
       <w:b/>
       <w:bCs/>
       <w:szCs w:val="26"/>
     </w:rPr>
   </w:style>
-  <w:style w:type="character" w:styleId="Overskrift3Tegn" w:customStyle="1">
+  <w:style w:type="character" w:customStyle="1" w:styleId="Overskrift3Tegn">
     <w:name w:val="Overskrift 3 Tegn"/>
     <w:basedOn w:val="Standardskrifttypeiafsnit"/>
     <w:link w:val="Overskrift3"/>
     <w:uiPriority w:val="9"/>
     <w:rsid w:val="003B2888"/>
     <w:rPr>
-      <w:rFonts w:ascii="Arial" w:hAnsi="Arial" w:eastAsiaTheme="majorEastAsia" w:cstheme="majorBidi"/>
+      <w:rFonts w:ascii="Arial" w:eastAsiaTheme="majorEastAsia" w:hAnsi="Arial" w:cstheme="majorBidi"/>
       <w:b/>
       <w:bCs/>
     </w:rPr>
@@ -2027,7 +2274,7 @@
       <w:szCs w:val="16"/>
     </w:rPr>
   </w:style>
-  <w:style w:type="character" w:styleId="MarkeringsbobletekstTegn" w:customStyle="1">
+  <w:style w:type="character" w:customStyle="1" w:styleId="MarkeringsbobletekstTegn">
     <w:name w:val="Markeringsbobletekst Tegn"/>
     <w:basedOn w:val="Standardskrifttypeiafsnit"/>
     <w:link w:val="Markeringsbobletekst"/>
@@ -2055,7 +2302,7 @@
       <w:spacing w:line="240" w:lineRule="auto"/>
     </w:pPr>
   </w:style>
-  <w:style w:type="character" w:styleId="SidehovedTegn" w:customStyle="1">
+  <w:style w:type="character" w:customStyle="1" w:styleId="SidehovedTegn">
     <w:name w:val="Sidehoved Tegn"/>
     <w:basedOn w:val="Standardskrifttypeiafsnit"/>
     <w:link w:val="Sidehoved"/>
@@ -2077,7 +2324,7 @@
       <w:spacing w:line="240" w:lineRule="auto"/>
     </w:pPr>
   </w:style>
-  <w:style w:type="character" w:styleId="SidefodTegn" w:customStyle="1">
+  <w:style w:type="character" w:customStyle="1" w:styleId="SidefodTegn">
     <w:name w:val="Sidefod Tegn"/>
     <w:basedOn w:val="Standardskrifttypeiafsnit"/>
     <w:link w:val="Sidefod"/>
@@ -2094,22 +2341,22 @@
     </w:pPr>
     <w:tblPr>
       <w:tblBorders>
-        <w:top w:val="single" w:color="auto" w:sz="4" w:space="0"/>
-        <w:left w:val="single" w:color="auto" w:sz="4" w:space="0"/>
-        <w:bottom w:val="single" w:color="auto" w:sz="4" w:space="0"/>
-        <w:right w:val="single" w:color="auto" w:sz="4" w:space="0"/>
-        <w:insideH w:val="single" w:color="auto" w:sz="4" w:space="0"/>
-        <w:insideV w:val="single" w:color="auto" w:sz="4" w:space="0"/>
+        <w:top w:val="single" w:sz="4" w:space="0" w:color="auto"/>
+        <w:left w:val="single" w:sz="4" w:space="0" w:color="auto"/>
+        <w:bottom w:val="single" w:sz="4" w:space="0" w:color="auto"/>
+        <w:right w:val="single" w:sz="4" w:space="0" w:color="auto"/>
+        <w:insideH w:val="single" w:sz="4" w:space="0" w:color="auto"/>
+        <w:insideV w:val="single" w:sz="4" w:space="0" w:color="auto"/>
       </w:tblBorders>
     </w:tblPr>
   </w:style>
-  <w:style w:type="paragraph" w:styleId="Returadresse" w:customStyle="1">
+  <w:style w:type="paragraph" w:customStyle="1" w:styleId="Returadresse">
     <w:name w:val="Returadresse"/>
     <w:basedOn w:val="Normal"/>
     <w:qFormat/>
     <w:rsid w:val="00D45F0A"/>
     <w:pPr>
-      <w:framePr w:wrap="around" w:hAnchor="page" w:vAnchor="page" w:x="1305" w:y="1929"/>
+      <w:framePr w:wrap="around" w:vAnchor="page" w:hAnchor="page" w:x="1305" w:y="1929"/>
       <w:spacing w:line="240" w:lineRule="auto"/>
       <w:suppressOverlap/>
     </w:pPr>
@@ -2118,14 +2365,14 @@
       <w:szCs w:val="16"/>
     </w:rPr>
   </w:style>
-  <w:style w:type="paragraph" w:styleId="Afsender" w:customStyle="1">
+  <w:style w:type="paragraph" w:customStyle="1" w:styleId="Afsender">
     <w:name w:val="Afsender"/>
     <w:basedOn w:val="Normal"/>
     <w:next w:val="Normal"/>
     <w:qFormat/>
     <w:rsid w:val="00D45F0A"/>
     <w:pPr>
-      <w:framePr w:wrap="around" w:hAnchor="page" w:vAnchor="page" w:x="8506" w:y="3743"/>
+      <w:framePr w:wrap="around" w:vAnchor="page" w:hAnchor="page" w:x="8506" w:y="3743"/>
       <w:spacing w:line="230" w:lineRule="atLeast"/>
       <w:suppressOverlap/>
     </w:pPr>
@@ -2134,17 +2381,17 @@
       <w:szCs w:val="19"/>
     </w:rPr>
   </w:style>
-  <w:style w:type="paragraph" w:styleId="Modtager" w:customStyle="1">
+  <w:style w:type="paragraph" w:customStyle="1" w:styleId="Modtager">
     <w:name w:val="Modtager"/>
     <w:basedOn w:val="Normal"/>
     <w:qFormat/>
     <w:rsid w:val="00902CB6"/>
     <w:pPr>
-      <w:framePr w:wrap="around" w:hAnchor="page" w:vAnchor="page" w:x="1305" w:y="1759"/>
+      <w:framePr w:wrap="around" w:vAnchor="page" w:hAnchor="page" w:x="1305" w:y="1759"/>
       <w:suppressOverlap/>
     </w:pPr>
   </w:style>
-  <w:style w:type="paragraph" w:styleId="Brevoverskrift" w:customStyle="1">
+  <w:style w:type="paragraph" w:customStyle="1" w:styleId="Brevoverskrift">
     <w:name w:val="Brevoverskrift"/>
     <w:basedOn w:val="Normal"/>
     <w:next w:val="Normal"/>
@@ -2168,12 +2415,12 @@
       <w:contextualSpacing/>
     </w:pPr>
   </w:style>
-  <w:style w:type="paragraph" w:styleId="ModtagerNavn" w:customStyle="1">
+  <w:style w:type="paragraph" w:customStyle="1" w:styleId="ModtagerNavn">
     <w:name w:val="ModtagerNavn"/>
     <w:basedOn w:val="Modtager"/>
     <w:rsid w:val="00827193"/>
     <w:pPr>
-      <w:framePr w:wrap="auto" w:hAnchor="text" w:vAnchor="margin" w:xAlign="left" w:yAlign="inline"/>
+      <w:framePr w:wrap="auto" w:vAnchor="margin" w:hAnchor="text" w:xAlign="left" w:yAlign="inline"/>
       <w:suppressOverlap w:val="0"/>
     </w:pPr>
     <w:rPr>
@@ -2181,12 +2428,12 @@
       <w:sz w:val="22"/>
     </w:rPr>
   </w:style>
-  <w:style w:type="paragraph" w:styleId="AfsenderAfdeling" w:customStyle="1">
+  <w:style w:type="paragraph" w:customStyle="1" w:styleId="AfsenderAfdeling">
     <w:name w:val="AfsenderAfdeling"/>
     <w:basedOn w:val="Afsender"/>
     <w:rsid w:val="002D4B99"/>
     <w:pPr>
-      <w:framePr w:wrap="auto" w:hAnchor="text" w:vAnchor="margin" w:xAlign="left" w:yAlign="inline"/>
+      <w:framePr w:wrap="auto" w:vAnchor="margin" w:hAnchor="text" w:xAlign="left" w:yAlign="inline"/>
       <w:spacing w:line="260" w:lineRule="atLeast"/>
       <w:suppressOverlap w:val="0"/>
     </w:pPr>
@@ -2196,13 +2443,13 @@
       <w:sz w:val="22"/>
     </w:rPr>
   </w:style>
-  <w:style w:type="paragraph" w:styleId="AfsenderFed" w:customStyle="1">
+  <w:style w:type="paragraph" w:customStyle="1" w:styleId="AfsenderFed">
     <w:name w:val="AfsenderFed"/>
     <w:basedOn w:val="Afsender"/>
     <w:next w:val="Afsender"/>
     <w:rsid w:val="008C6EFD"/>
     <w:pPr>
-      <w:framePr w:wrap="auto" w:hAnchor="text" w:vAnchor="margin" w:xAlign="left" w:yAlign="inline"/>
+      <w:framePr w:wrap="auto" w:vAnchor="margin" w:hAnchor="text" w:xAlign="left" w:yAlign="inline"/>
       <w:suppressOverlap w:val="0"/>
     </w:pPr>
     <w:rPr>
@@ -2496,27 +2743,6 @@
 </file>
 
 <file path=customXml/item1.xml><?xml version="1.0" encoding="utf-8"?>
-<p:properties xmlns:p="http://schemas.microsoft.com/office/2006/metadata/properties" xmlns:xsi="http://www.w3.org/2001/XMLSchema-instance" xmlns:pc="http://schemas.microsoft.com/office/infopath/2007/PartnerControls">
-  <documentManagement>
-    <TaxCatchAll xmlns="23db8a79-3cb7-41f6-9b9b-00da4de10ae9" xsi:nil="true"/>
-    <Afdeling xmlns="756e02e7-d389-4360-b935-4d92569df815" xsi:nil="true"/>
-    <lcf76f155ced4ddcb4097134ff3c332f xmlns="756e02e7-d389-4360-b935-4d92569df815">
-      <Terms xmlns="http://schemas.microsoft.com/office/infopath/2007/PartnerControls"/>
-    </lcf76f155ced4ddcb4097134ff3c332f>
-  </documentManagement>
-</p:properties>
-</file>
-
-<file path=customXml/item2.xml><?xml version="1.0" encoding="utf-8"?>
-<?mso-contentType ?>
-<FormTemplates xmlns="http://schemas.microsoft.com/sharepoint/v3/contenttype/forms">
-  <Display>DocumentLibraryForm</Display>
-  <Edit>DocumentLibraryForm</Edit>
-  <New>DocumentLibraryForm</New>
-</FormTemplates>
-</file>
-
-<file path=customXml/item3.xml><?xml version="1.0" encoding="utf-8"?>
 <ct:contentTypeSchema xmlns:ct="http://schemas.microsoft.com/office/2006/metadata/contentType" xmlns:ma="http://schemas.microsoft.com/office/2006/metadata/properties/metaAttributes" ct:_="" ma:_="" ma:contentTypeName="Dokument" ma:contentTypeID="0x010100F0AE6204ACA01A4990E971AD9D6A590A" ma:contentTypeVersion="16" ma:contentTypeDescription="Opret et nyt dokument." ma:contentTypeScope="" ma:versionID="ca47e3409eaab1642cdc7c3b018e661a">
   <xsd:schema xmlns:xsd="http://www.w3.org/2001/XMLSchema" xmlns:xs="http://www.w3.org/2001/XMLSchema" xmlns:p="http://schemas.microsoft.com/office/2006/metadata/properties" xmlns:ns2="756e02e7-d389-4360-b935-4d92569df815" xmlns:ns3="23db8a79-3cb7-41f6-9b9b-00da4de10ae9" targetNamespace="http://schemas.microsoft.com/office/2006/metadata/properties" ma:root="true" ma:fieldsID="a77ef811a2949d7839e0a1c226e3de57" ns2:_="" ns3:_="">
     <xsd:import namespace="756e02e7-d389-4360-b935-4d92569df815"/>
@@ -2759,27 +2985,67 @@
 </ct:contentTypeSchema>
 </file>
 
+<file path=customXml/item2.xml><?xml version="1.0" encoding="utf-8"?>
+<p:properties xmlns:p="http://schemas.microsoft.com/office/2006/metadata/properties" xmlns:xsi="http://www.w3.org/2001/XMLSchema-instance" xmlns:pc="http://schemas.microsoft.com/office/infopath/2007/PartnerControls">
+  <documentManagement>
+    <TaxCatchAll xmlns="23db8a79-3cb7-41f6-9b9b-00da4de10ae9" xsi:nil="true"/>
+    <Afdeling xmlns="756e02e7-d389-4360-b935-4d92569df815" xsi:nil="true"/>
+    <lcf76f155ced4ddcb4097134ff3c332f xmlns="756e02e7-d389-4360-b935-4d92569df815">
+      <Terms xmlns="http://schemas.microsoft.com/office/infopath/2007/PartnerControls"/>
+    </lcf76f155ced4ddcb4097134ff3c332f>
+  </documentManagement>
+</p:properties>
+</file>
+
+<file path=customXml/item3.xml><?xml version="1.0" encoding="utf-8"?>
+<?mso-contentType ?>
+<FormTemplates xmlns="http://schemas.microsoft.com/sharepoint/v3/contenttype/forms">
+  <Display>DocumentLibraryForm</Display>
+  <Edit>DocumentLibraryForm</Edit>
+  <New>DocumentLibraryForm</New>
+</FormTemplates>
+</file>
+
 <file path=customXml/itemProps1.xml><?xml version="1.0" encoding="utf-8"?>
-<ds:datastoreItem xmlns:ds="http://schemas.openxmlformats.org/officeDocument/2006/customXml" ds:itemID="{ECE343B1-A328-40FE-AA73-25C72A0BDE20}">
+<ds:datastoreItem xmlns:ds="http://schemas.openxmlformats.org/officeDocument/2006/customXml" ds:itemID="{8B79F14D-E63E-458D-AAE6-DFA7B68DECD7}">
   <ds:schemaRefs>
+    <ds:schemaRef ds:uri="http://schemas.microsoft.com/office/2006/metadata/contentType"/>
+    <ds:schemaRef ds:uri="http://schemas.microsoft.com/office/2006/metadata/properties/metaAttributes"/>
+    <ds:schemaRef ds:uri="http://www.w3.org/2001/XMLSchema"/>
     <ds:schemaRef ds:uri="http://schemas.microsoft.com/office/2006/metadata/properties"/>
+    <ds:schemaRef ds:uri="756e02e7-d389-4360-b935-4d92569df815"/>
+    <ds:schemaRef ds:uri="23db8a79-3cb7-41f6-9b9b-00da4de10ae9"/>
+    <ds:schemaRef ds:uri="http://schemas.microsoft.com/office/2006/documentManagement/types"/>
     <ds:schemaRef ds:uri="http://schemas.microsoft.com/office/infopath/2007/PartnerControls"/>
-    <ds:schemaRef ds:uri="http://schemas.microsoft.com/sharepoint/v3"/>
-    <ds:schemaRef ds:uri="66814e00-d64e-43ab-9546-a1a9813285c5"/>
-    <ds:schemaRef ds:uri="ff038efd-60d5-4198-a271-1b789e3e63e2"/>
-    <ds:schemaRef ds:uri="5F5AADCB-D137-4897-87C9-014998246EC8"/>
+    <ds:schemaRef ds:uri="http://schemas.openxmlformats.org/package/2006/metadata/core-properties"/>
+    <ds:schemaRef ds:uri="http://purl.org/dc/elements/1.1/"/>
+    <ds:schemaRef ds:uri="http://purl.org/dc/terms/"/>
+    <ds:schemaRef ds:uri="http://schemas.microsoft.com/internal/obd"/>
   </ds:schemaRefs>
 </ds:datastoreItem>
 </file>
 
 <file path=customXml/itemProps2.xml><?xml version="1.0" encoding="utf-8"?>
+<ds:datastoreItem xmlns:ds="http://schemas.openxmlformats.org/officeDocument/2006/customXml" ds:itemID="{ECE343B1-A328-40FE-AA73-25C72A0BDE20}">
+  <ds:schemaRefs>
+    <ds:schemaRef ds:uri="http://purl.org/dc/elements/1.1/"/>
+    <ds:schemaRef ds:uri="http://schemas.microsoft.com/office/2006/metadata/properties"/>
+    <ds:schemaRef ds:uri="http://purl.org/dc/terms/"/>
+    <ds:schemaRef ds:uri="23db8a79-3cb7-41f6-9b9b-00da4de10ae9"/>
+    <ds:schemaRef ds:uri="http://schemas.microsoft.com/office/2006/documentManagement/types"/>
+    <ds:schemaRef ds:uri="http://schemas.microsoft.com/office/infopath/2007/PartnerControls"/>
+    <ds:schemaRef ds:uri="http://schemas.openxmlformats.org/package/2006/metadata/core-properties"/>
+    <ds:schemaRef ds:uri="756e02e7-d389-4360-b935-4d92569df815"/>
+    <ds:schemaRef ds:uri="http://www.w3.org/XML/1998/namespace"/>
+    <ds:schemaRef ds:uri="http://purl.org/dc/dcmitype/"/>
+  </ds:schemaRefs>
+</ds:datastoreItem>
+</file>
+
+<file path=customXml/itemProps3.xml><?xml version="1.0" encoding="utf-8"?>
 <ds:datastoreItem xmlns:ds="http://schemas.openxmlformats.org/officeDocument/2006/customXml" ds:itemID="{BCA9CDF8-8657-458C-A760-F010E37CF3D9}">
   <ds:schemaRefs>
     <ds:schemaRef ds:uri="http://schemas.microsoft.com/sharepoint/v3/contenttype/forms"/>
   </ds:schemaRefs>
 </ds:datastoreItem>
-</file>
-
-<file path=customXml/itemProps3.xml><?xml version="1.0" encoding="utf-8"?>
-<ds:datastoreItem xmlns:ds="http://schemas.openxmlformats.org/officeDocument/2006/customXml" ds:itemID="{8B79F14D-E63E-458D-AAE6-DFA7B68DECD7}"/>
 </file>
</xml_diff>